<commit_message>
Add Ignis engine, mobile robot and CardCol projects; add 4X-Robots role
Removes the drones summer-school project card (the elective stays in the
coursework list). Word CVs keep the robotics projects and fit two pages.

Co-Authored-By: Claude Fable 5.1 <noreply@anthropic.com>
</commit_message>
<xml_diff>
--- a/public/Phillip_Christopher_Faerch_CV.docx
+++ b/public/Phillip_Christopher_Faerch_CV.docx
@@ -43,7 +43,7 @@
         </w:rPr>
         <w:t xml:space="preserve">Address: Nyborgvej 103, 2. tv., 5000 Odense C   ·   +45 22 18 77 00   ·   </w:t>
       </w:r>
-      <w:hyperlink w:history="1" r:id="rIdbu31x9rxkcmwpb1pyapjj">
+      <w:hyperlink w:history="1" r:id="rId7lsv3ytyy6hvmopbwpova">
         <w:r>
           <w:rPr>
             <w:rFonts w:ascii="Calibri" w:cs="Calibri" w:eastAsia="Calibri" w:hAnsi="Calibri"/>
@@ -69,7 +69,7 @@
         </w:rPr>
         <w:t xml:space="preserve">Born: 15 January 2002   ·   GitHub: </w:t>
       </w:r>
-      <w:hyperlink w:history="1" r:id="rIdxydeeial1bhxqjb7pqpqu">
+      <w:hyperlink w:history="1" r:id="rId-agr11vuffyrw72bwd-zw">
         <w:r>
           <w:rPr>
             <w:rFonts w:ascii="Calibri" w:cs="Calibri" w:eastAsia="Calibri" w:hAnsi="Calibri"/>
@@ -139,7 +139,7 @@
     <w:p>
       <w:pPr>
         <w:tabs>
-          <w:tab w:val="right" w:pos="9746"/>
+          <w:tab w:val="right" w:pos="10106"/>
         </w:tabs>
         <w:spacing w:after="10" w:before="90"/>
       </w:pPr>
@@ -195,7 +195,7 @@
     <w:p>
       <w:pPr>
         <w:tabs>
-          <w:tab w:val="right" w:pos="9746"/>
+          <w:tab w:val="right" w:pos="10106"/>
         </w:tabs>
         <w:spacing w:after="10" w:before="90"/>
       </w:pPr>
@@ -432,7 +432,7 @@
     <w:p>
       <w:pPr>
         <w:tabs>
-          <w:tab w:val="right" w:pos="9746"/>
+          <w:tab w:val="right" w:pos="10106"/>
         </w:tabs>
         <w:spacing w:after="10" w:before="60"/>
       </w:pPr>
@@ -469,7 +469,7 @@
     <w:p>
       <w:pPr>
         <w:tabs>
-          <w:tab w:val="right" w:pos="9746"/>
+          <w:tab w:val="right" w:pos="10106"/>
         </w:tabs>
         <w:spacing w:after="10" w:before="60"/>
       </w:pPr>
@@ -506,7 +506,7 @@
     <w:p>
       <w:pPr>
         <w:tabs>
-          <w:tab w:val="right" w:pos="9746"/>
+          <w:tab w:val="right" w:pos="10106"/>
         </w:tabs>
         <w:spacing w:after="10" w:before="60"/>
       </w:pPr>
@@ -543,7 +543,7 @@
     <w:p>
       <w:pPr>
         <w:tabs>
-          <w:tab w:val="right" w:pos="9746"/>
+          <w:tab w:val="right" w:pos="10106"/>
         </w:tabs>
         <w:spacing w:after="10" w:before="60"/>
       </w:pPr>
@@ -600,7 +600,7 @@
     <w:p>
       <w:pPr>
         <w:tabs>
-          <w:tab w:val="right" w:pos="9746"/>
+          <w:tab w:val="right" w:pos="10106"/>
         </w:tabs>
         <w:spacing w:after="10" w:before="90"/>
       </w:pPr>
@@ -655,63 +655,6 @@
     </w:p>
     <w:p>
       <w:pPr>
-        <w:pStyle w:val="ListParagraph"/>
-        <w:numPr>
-          <w:ilvl w:val="0"/>
-          <w:numId w:val="2"/>
-        </w:numPr>
-        <w:spacing w:after="40"/>
-      </w:pPr>
-      <w:r>
-        <w:rPr>
-          <w:rFonts w:ascii="Calibri" w:cs="Calibri" w:eastAsia="Calibri" w:hAnsi="Calibri"/>
-          <w:color w:val="2B2620"/>
-          <w:sz w:val="20"/>
-          <w:szCs w:val="20"/>
-        </w:rPr>
-        <w:t xml:space="preserve">Five gaits: walk, trot, amble, canter and gallop, switchable at runtime.</w:t>
-      </w:r>
-    </w:p>
-    <w:p>
-      <w:pPr>
-        <w:pStyle w:val="ListParagraph"/>
-        <w:numPr>
-          <w:ilvl w:val="0"/>
-          <w:numId w:val="2"/>
-        </w:numPr>
-        <w:spacing w:after="40"/>
-      </w:pPr>
-      <w:r>
-        <w:rPr>
-          <w:rFonts w:ascii="Calibri" w:cs="Calibri" w:eastAsia="Calibri" w:hAnsi="Calibri"/>
-          <w:color w:val="2B2620"/>
-          <w:sz w:val="20"/>
-          <w:szCs w:val="20"/>
-        </w:rPr>
-        <w:t xml:space="preserve">OIAC compared against a classic PD controller on cost of transport and tracking error.</w:t>
-      </w:r>
-    </w:p>
-    <w:p>
-      <w:pPr>
-        <w:pStyle w:val="ListParagraph"/>
-        <w:numPr>
-          <w:ilvl w:val="0"/>
-          <w:numId w:val="2"/>
-        </w:numPr>
-        <w:spacing w:after="40"/>
-      </w:pPr>
-      <w:r>
-        <w:rPr>
-          <w:rFonts w:ascii="Calibri" w:cs="Calibri" w:eastAsia="Calibri" w:hAnsi="Calibri"/>
-          <w:color w:val="2B2620"/>
-          <w:sz w:val="20"/>
-          <w:szCs w:val="20"/>
-        </w:rPr>
-        <w:t xml:space="preserve">Gymnasium environment with Stable-Baselines3 and CMA-ES for automatic gait tuning.</w:t>
-      </w:r>
-    </w:p>
-    <w:p>
-      <w:pPr>
         <w:spacing w:after="60"/>
       </w:pPr>
       <w:r>
@@ -732,7 +675,7 @@
         </w:rPr>
         <w:t xml:space="preserve">   ·   Repository: </w:t>
       </w:r>
-      <w:hyperlink w:history="1" r:id="rIdtpjsgau82eset0tvhhvq2">
+      <w:hyperlink w:history="1" r:id="rIdh-ei7dwxgbdmedbnggdcu">
         <w:r>
           <w:rPr>
             <w:rFonts w:ascii="Calibri" w:cs="Calibri" w:eastAsia="Calibri" w:hAnsi="Calibri"/>
@@ -748,7 +691,7 @@
     <w:p>
       <w:pPr>
         <w:tabs>
-          <w:tab w:val="right" w:pos="9746"/>
+          <w:tab w:val="right" w:pos="10106"/>
         </w:tabs>
         <w:spacing w:after="10" w:before="90"/>
       </w:pPr>
@@ -823,7 +766,7 @@
         </w:rPr>
         <w:t xml:space="preserve">   ·   Repository: </w:t>
       </w:r>
-      <w:hyperlink w:history="1" r:id="rIdjhqszexmymk8k9nukrio-">
+      <w:hyperlink w:history="1" r:id="rIdv_5rvtotj11osvcn7xdfv">
         <w:r>
           <w:rPr>
             <w:rFonts w:ascii="Calibri" w:cs="Calibri" w:eastAsia="Calibri" w:hAnsi="Calibri"/>
@@ -839,7 +782,7 @@
     <w:p>
       <w:pPr>
         <w:tabs>
-          <w:tab w:val="right" w:pos="9746"/>
+          <w:tab w:val="right" w:pos="10106"/>
         </w:tabs>
         <w:spacing w:after="10" w:before="90"/>
       </w:pPr>
@@ -852,6 +795,97 @@
           <w:sz w:val="22"/>
           <w:szCs w:val="22"/>
         </w:rPr>
+        <w:t xml:space="preserve">Mobile robot controlled by audio tones (DTMF)</w:t>
+      </w:r>
+      <w:r>
+        <w:rPr>
+          <w:rFonts w:ascii="Calibri" w:cs="Calibri" w:eastAsia="Calibri" w:hAnsi="Calibri"/>
+          <w:color w:val="6F665C"/>
+          <w:sz w:val="19"/>
+          <w:szCs w:val="19"/>
+        </w:rPr>
+        <w:t xml:space="preserve">	</w:t>
+      </w:r>
+    </w:p>
+    <w:p>
+      <w:pPr>
+        <w:spacing w:after="40"/>
+      </w:pPr>
+      <w:r>
+        <w:rPr>
+          <w:rFonts w:ascii="Calibri" w:cs="Calibri" w:eastAsia="Calibri" w:hAnsi="Calibri"/>
+          <w:color w:val="6F665C"/>
+          <w:sz w:val="20"/>
+          <w:szCs w:val="20"/>
+        </w:rPr>
+        <w:t xml:space="preserve">Semester project · 3rd semester · Autumn 2024</w:t>
+      </w:r>
+    </w:p>
+    <w:p>
+      <w:pPr>
+        <w:spacing w:after="60"/>
+      </w:pPr>
+      <w:r>
+        <w:rPr>
+          <w:rFonts w:ascii="Calibri" w:cs="Calibri" w:eastAsia="Calibri" w:hAnsi="Calibri"/>
+          <w:color w:val="2B2620"/>
+          <w:sz w:val="20"/>
+          <w:szCs w:val="20"/>
+        </w:rPr>
+        <w:t xml:space="preserve">A TurtleBot3 Burger driven over sound: commands are encoded as DTMF tones, played from a PC and decoded on the robot with the Goertzel algorithm. The C++ stack is split into physical, data-link, transport and application layers with CRC error detection and timers for retransmission, mirroring a classic network protocol stack. Fully Doxygen-documented.</w:t>
+      </w:r>
+    </w:p>
+    <w:p>
+      <w:pPr>
+        <w:spacing w:after="60"/>
+      </w:pPr>
+      <w:r>
+        <w:rPr>
+          <w:rFonts w:ascii="Calibri" w:cs="Calibri" w:eastAsia="Calibri" w:hAnsi="Calibri"/>
+          <w:color w:val="6F665C"/>
+          <w:sz w:val="19"/>
+          <w:szCs w:val="19"/>
+        </w:rPr>
+        <w:t xml:space="preserve">C++ · Signal processing · Goertzel / FFT · Protocol design · TurtleBot3 · PortAudio · Doxygen</w:t>
+      </w:r>
+      <w:r>
+        <w:rPr>
+          <w:rFonts w:ascii="Calibri" w:cs="Calibri" w:eastAsia="Calibri" w:hAnsi="Calibri"/>
+          <w:color w:val="6F665C"/>
+          <w:sz w:val="19"/>
+          <w:szCs w:val="19"/>
+        </w:rPr>
+        <w:t xml:space="preserve">   ·   Repository: </w:t>
+      </w:r>
+      <w:hyperlink w:history="1" r:id="rIdnyj8h31nas3tcnv2z-jqs">
+        <w:r>
+          <w:rPr>
+            <w:rFonts w:ascii="Calibri" w:cs="Calibri" w:eastAsia="Calibri" w:hAnsi="Calibri"/>
+            <w:color w:val="4E5A38"/>
+            <w:sz w:val="21"/>
+            <w:szCs w:val="21"/>
+            <w:u w:val="single"/>
+          </w:rPr>
+          <w:t xml:space="preserve">github.com/Toasting-Snowdragon-9999/Mobile_robotsystem</w:t>
+        </w:r>
+      </w:hyperlink>
+    </w:p>
+    <w:p>
+      <w:pPr>
+        <w:tabs>
+          <w:tab w:val="right" w:pos="10106"/>
+        </w:tabs>
+        <w:spacing w:after="10" w:before="90"/>
+      </w:pPr>
+      <w:r>
+        <w:rPr>
+          <w:rFonts w:ascii="Calibri" w:cs="Calibri" w:eastAsia="Calibri" w:hAnsi="Calibri"/>
+          <w:b/>
+          <w:bCs/>
+          <w:color w:val="2B2620"/>
+          <w:sz w:val="22"/>
+          <w:szCs w:val="22"/>
+        </w:rPr>
         <w:t xml:space="preserve">EMG-driven finger exoskeleton for tremor suppression</w:t>
       </w:r>
       <w:r>
@@ -904,6 +938,76 @@
           <w:szCs w:val="19"/>
         </w:rPr>
         <w:t xml:space="preserve">Python · Signal processing · EMG · Biomechatronics</w:t>
+      </w:r>
+    </w:p>
+    <w:p>
+      <w:pPr>
+        <w:tabs>
+          <w:tab w:val="right" w:pos="10106"/>
+        </w:tabs>
+        <w:spacing w:after="10" w:before="90"/>
+      </w:pPr>
+      <w:r>
+        <w:rPr>
+          <w:rFonts w:ascii="Calibri" w:cs="Calibri" w:eastAsia="Calibri" w:hAnsi="Calibri"/>
+          <w:b/>
+          <w:bCs/>
+          <w:color w:val="2B2620"/>
+          <w:sz w:val="22"/>
+          <w:szCs w:val="22"/>
+        </w:rPr>
+        <w:t xml:space="preserve">Ignis – C++ rendering and game engine</w:t>
+      </w:r>
+      <w:r>
+        <w:rPr>
+          <w:rFonts w:ascii="Calibri" w:cs="Calibri" w:eastAsia="Calibri" w:hAnsi="Calibri"/>
+          <w:color w:val="6F665C"/>
+          <w:sz w:val="19"/>
+          <w:szCs w:val="19"/>
+        </w:rPr>
+        <w:t xml:space="preserve">	</w:t>
+      </w:r>
+    </w:p>
+    <w:p>
+      <w:pPr>
+        <w:spacing w:after="40"/>
+      </w:pPr>
+      <w:r>
+        <w:rPr>
+          <w:rFonts w:ascii="Calibri" w:cs="Calibri" w:eastAsia="Calibri" w:hAnsi="Calibri"/>
+          <w:color w:val="6F665C"/>
+          <w:sz w:val="20"/>
+          <w:szCs w:val="20"/>
+        </w:rPr>
+        <w:t xml:space="preserve">Personal project · 2025–present · part of the Helios project</w:t>
+      </w:r>
+    </w:p>
+    <w:p>
+      <w:pPr>
+        <w:spacing w:after="60"/>
+      </w:pPr>
+      <w:r>
+        <w:rPr>
+          <w:rFonts w:ascii="Calibri" w:cs="Calibri" w:eastAsia="Calibri" w:hAnsi="Calibri"/>
+          <w:color w:val="2B2620"/>
+          <w:sz w:val="20"/>
+          <w:szCs w:val="20"/>
+        </w:rPr>
+        <w:t xml:space="preserve">A from-scratch OpenGL engine in modern C++ with a streamed procedural voxel planet as the test world. Chunk generation and meshing run on a priority job system across worker threads while the render thread uploads to the GPU, keeping the world at well over 1000 fps as the player moves. Includes a quaternion-based free-flight camera, day/night lighting, a Fresnel ocean shader, an entity and inventory system, and an ImGui debug overlay. Built with CMake, GLFW, GLAD, GLM, Assimp and headless test suites.</w:t>
+      </w:r>
+    </w:p>
+    <w:p>
+      <w:pPr>
+        <w:spacing w:after="60"/>
+      </w:pPr>
+      <w:r>
+        <w:rPr>
+          <w:rFonts w:ascii="Calibri" w:cs="Calibri" w:eastAsia="Calibri" w:hAnsi="Calibri"/>
+          <w:color w:val="6F665C"/>
+          <w:sz w:val="19"/>
+          <w:szCs w:val="19"/>
+        </w:rPr>
+        <w:t xml:space="preserve">C++ · OpenGL · GLSL · Multithreading · CMake · Procedural generation · ImGui</w:t>
       </w:r>
     </w:p>
     <w:p>
@@ -929,7 +1033,7 @@
     <w:p>
       <w:pPr>
         <w:tabs>
-          <w:tab w:val="right" w:pos="9746"/>
+          <w:tab w:val="right" w:pos="10106"/>
         </w:tabs>
         <w:spacing w:after="10" w:before="90"/>
       </w:pPr>
@@ -951,25 +1055,20 @@
           <w:sz w:val="19"/>
           <w:szCs w:val="19"/>
         </w:rPr>
+        <w:t xml:space="preserve">  ·  4X-Robots, Odense</w:t>
+      </w:r>
+      <w:r>
+        <w:rPr>
+          <w:rFonts w:ascii="Calibri" w:cs="Calibri" w:eastAsia="Calibri" w:hAnsi="Calibri"/>
+          <w:color w:val="6F665C"/>
+          <w:sz w:val="19"/>
+          <w:szCs w:val="19"/>
+        </w:rPr>
         <w:t xml:space="preserve">	04/2024 – present</w:t>
       </w:r>
     </w:p>
     <w:p>
       <w:pPr>
-        <w:spacing w:after="40"/>
-      </w:pPr>
-      <w:r>
-        <w:rPr>
-          <w:rFonts w:ascii="Calibri" w:cs="Calibri" w:eastAsia="Calibri" w:hAnsi="Calibri"/>
-          <w:color w:val="6F665C"/>
-          <w:sz w:val="20"/>
-          <w:szCs w:val="20"/>
-        </w:rPr>
-        <w:t xml:space="preserve">4X-Robots · Odense</w:t>
-      </w:r>
-    </w:p>
-    <w:p>
-      <w:pPr>
         <w:spacing w:after="60"/>
       </w:pPr>
       <w:r>
@@ -985,7 +1084,7 @@
     <w:p>
       <w:pPr>
         <w:tabs>
-          <w:tab w:val="right" w:pos="9746"/>
+          <w:tab w:val="right" w:pos="10106"/>
         </w:tabs>
         <w:spacing w:after="10" w:before="90"/>
       </w:pPr>
@@ -1007,25 +1106,20 @@
           <w:sz w:val="19"/>
           <w:szCs w:val="19"/>
         </w:rPr>
+        <w:t xml:space="preserve">  ·  Fitness World / PureGym, Holbæk</w:t>
+      </w:r>
+      <w:r>
+        <w:rPr>
+          <w:rFonts w:ascii="Calibri" w:cs="Calibri" w:eastAsia="Calibri" w:hAnsi="Calibri"/>
+          <w:color w:val="6F665C"/>
+          <w:sz w:val="19"/>
+          <w:szCs w:val="19"/>
+        </w:rPr>
         <w:t xml:space="preserve">	11/2020 – 08/2023</w:t>
       </w:r>
     </w:p>
     <w:p>
       <w:pPr>
-        <w:spacing w:after="40"/>
-      </w:pPr>
-      <w:r>
-        <w:rPr>
-          <w:rFonts w:ascii="Calibri" w:cs="Calibri" w:eastAsia="Calibri" w:hAnsi="Calibri"/>
-          <w:color w:val="6F665C"/>
-          <w:sz w:val="20"/>
-          <w:szCs w:val="20"/>
-        </w:rPr>
-        <w:t xml:space="preserve">Fitness World / PureGym · Holbæk</w:t>
-      </w:r>
-    </w:p>
-    <w:p>
-      <w:pPr>
         <w:spacing w:after="60"/>
       </w:pPr>
       <w:r>
@@ -1041,7 +1135,7 @@
     <w:p>
       <w:pPr>
         <w:tabs>
-          <w:tab w:val="right" w:pos="9746"/>
+          <w:tab w:val="right" w:pos="10106"/>
         </w:tabs>
         <w:spacing w:after="10" w:before="90"/>
       </w:pPr>
@@ -1063,25 +1157,20 @@
           <w:sz w:val="19"/>
           <w:szCs w:val="19"/>
         </w:rPr>
+        <w:t xml:space="preserve">  ·  Katrinedalskolen, afd. Tuse, Holbæk</w:t>
+      </w:r>
+      <w:r>
+        <w:rPr>
+          <w:rFonts w:ascii="Calibri" w:cs="Calibri" w:eastAsia="Calibri" w:hAnsi="Calibri"/>
+          <w:color w:val="6F665C"/>
+          <w:sz w:val="19"/>
+          <w:szCs w:val="19"/>
+        </w:rPr>
         <w:t xml:space="preserve">	08/2022 – 07/2023</w:t>
       </w:r>
     </w:p>
     <w:p>
       <w:pPr>
-        <w:spacing w:after="40"/>
-      </w:pPr>
-      <w:r>
-        <w:rPr>
-          <w:rFonts w:ascii="Calibri" w:cs="Calibri" w:eastAsia="Calibri" w:hAnsi="Calibri"/>
-          <w:color w:val="6F665C"/>
-          <w:sz w:val="20"/>
-          <w:szCs w:val="20"/>
-        </w:rPr>
-        <w:t xml:space="preserve">Katrinedalskolen, afd. Tuse · Holbæk</w:t>
-      </w:r>
-    </w:p>
-    <w:p>
-      <w:pPr>
         <w:spacing w:after="60"/>
       </w:pPr>
       <w:r>
@@ -1097,7 +1186,7 @@
     <w:p>
       <w:pPr>
         <w:tabs>
-          <w:tab w:val="right" w:pos="9746"/>
+          <w:tab w:val="right" w:pos="10106"/>
         </w:tabs>
         <w:spacing w:after="10" w:before="90"/>
       </w:pPr>
@@ -1119,25 +1208,20 @@
           <w:sz w:val="19"/>
           <w:szCs w:val="19"/>
         </w:rPr>
+        <w:t xml:space="preserve">  ·  Museum Vestsjælland, Malergården, Kirke Såby</w:t>
+      </w:r>
+      <w:r>
+        <w:rPr>
+          <w:rFonts w:ascii="Calibri" w:cs="Calibri" w:eastAsia="Calibri" w:hAnsi="Calibri"/>
+          <w:color w:val="6F665C"/>
+          <w:sz w:val="19"/>
+          <w:szCs w:val="19"/>
+        </w:rPr>
         <w:t xml:space="preserve">	06/2022 – 09/2022</w:t>
       </w:r>
     </w:p>
     <w:p>
       <w:pPr>
-        <w:spacing w:after="40"/>
-      </w:pPr>
-      <w:r>
-        <w:rPr>
-          <w:rFonts w:ascii="Calibri" w:cs="Calibri" w:eastAsia="Calibri" w:hAnsi="Calibri"/>
-          <w:color w:val="6F665C"/>
-          <w:sz w:val="20"/>
-          <w:szCs w:val="20"/>
-        </w:rPr>
-        <w:t xml:space="preserve">Museum Vestsjælland, Malergården · Kirke Såby</w:t>
-      </w:r>
-    </w:p>
-    <w:p>
-      <w:pPr>
         <w:spacing w:after="60"/>
       </w:pPr>
       <w:r>
@@ -1153,7 +1237,7 @@
     <w:p>
       <w:pPr>
         <w:tabs>
-          <w:tab w:val="right" w:pos="9746"/>
+          <w:tab w:val="right" w:pos="10106"/>
         </w:tabs>
         <w:spacing w:after="10" w:before="90"/>
       </w:pPr>
@@ -1175,25 +1259,20 @@
           <w:sz w:val="19"/>
           <w:szCs w:val="19"/>
         </w:rPr>
+        <w:t xml:space="preserve">  ·  Rema 1000, Holbæk</w:t>
+      </w:r>
+      <w:r>
+        <w:rPr>
+          <w:rFonts w:ascii="Calibri" w:cs="Calibri" w:eastAsia="Calibri" w:hAnsi="Calibri"/>
+          <w:color w:val="6F665C"/>
+          <w:sz w:val="19"/>
+          <w:szCs w:val="19"/>
+        </w:rPr>
         <w:t xml:space="preserve">	07/2019 – 01/2020</w:t>
       </w:r>
     </w:p>
     <w:p>
       <w:pPr>
-        <w:spacing w:after="40"/>
-      </w:pPr>
-      <w:r>
-        <w:rPr>
-          <w:rFonts w:ascii="Calibri" w:cs="Calibri" w:eastAsia="Calibri" w:hAnsi="Calibri"/>
-          <w:color w:val="6F665C"/>
-          <w:sz w:val="20"/>
-          <w:szCs w:val="20"/>
-        </w:rPr>
-        <w:t xml:space="preserve">Rema 1000 · Holbæk</w:t>
-      </w:r>
-    </w:p>
-    <w:p>
-      <w:pPr>
         <w:spacing w:after="60"/>
       </w:pPr>
       <w:r>
@@ -1209,7 +1288,7 @@
     <w:p>
       <w:pPr>
         <w:tabs>
-          <w:tab w:val="right" w:pos="9746"/>
+          <w:tab w:val="right" w:pos="10106"/>
         </w:tabs>
         <w:spacing w:after="10" w:before="90"/>
       </w:pPr>
@@ -1231,25 +1310,20 @@
           <w:sz w:val="19"/>
           <w:szCs w:val="19"/>
         </w:rPr>
+        <w:t xml:space="preserve">  ·  Gourmethuset Store Børs, Roskilde</w:t>
+      </w:r>
+      <w:r>
+        <w:rPr>
+          <w:rFonts w:ascii="Calibri" w:cs="Calibri" w:eastAsia="Calibri" w:hAnsi="Calibri"/>
+          <w:color w:val="6F665C"/>
+          <w:sz w:val="19"/>
+          <w:szCs w:val="19"/>
+        </w:rPr>
         <w:t xml:space="preserve">	05/2016 – 09/2019</w:t>
       </w:r>
     </w:p>
     <w:p>
       <w:pPr>
-        <w:spacing w:after="40"/>
-      </w:pPr>
-      <w:r>
-        <w:rPr>
-          <w:rFonts w:ascii="Calibri" w:cs="Calibri" w:eastAsia="Calibri" w:hAnsi="Calibri"/>
-          <w:color w:val="6F665C"/>
-          <w:sz w:val="20"/>
-          <w:szCs w:val="20"/>
-        </w:rPr>
-        <w:t xml:space="preserve">Gourmethuset Store Børs · Roskilde</w:t>
-      </w:r>
-    </w:p>
-    <w:p>
-      <w:pPr>
         <w:spacing w:after="60"/>
       </w:pPr>
       <w:r>
@@ -1265,7 +1339,7 @@
     <w:p>
       <w:pPr>
         <w:tabs>
-          <w:tab w:val="right" w:pos="9746"/>
+          <w:tab w:val="right" w:pos="10106"/>
         </w:tabs>
         <w:spacing w:after="10" w:before="90"/>
       </w:pPr>
@@ -1287,21 +1361,16 @@
           <w:sz w:val="19"/>
           <w:szCs w:val="19"/>
         </w:rPr>
+        <w:t xml:space="preserve">  ·  NordVestNyt, Holbæk</w:t>
+      </w:r>
+      <w:r>
+        <w:rPr>
+          <w:rFonts w:ascii="Calibri" w:cs="Calibri" w:eastAsia="Calibri" w:hAnsi="Calibri"/>
+          <w:color w:val="6F665C"/>
+          <w:sz w:val="19"/>
+          <w:szCs w:val="19"/>
+        </w:rPr>
         <w:t xml:space="preserve">	03/2015 – 09/2016</w:t>
-      </w:r>
-    </w:p>
-    <w:p>
-      <w:pPr>
-        <w:spacing w:after="40"/>
-      </w:pPr>
-      <w:r>
-        <w:rPr>
-          <w:rFonts w:ascii="Calibri" w:cs="Calibri" w:eastAsia="Calibri" w:hAnsi="Calibri"/>
-          <w:color w:val="6F665C"/>
-          <w:sz w:val="20"/>
-          <w:szCs w:val="20"/>
-        </w:rPr>
-        <w:t xml:space="preserve">NordVestNyt · Holbæk</w:t>
       </w:r>
     </w:p>
     <w:p>
@@ -1488,7 +1557,7 @@
     </w:p>
     <w:sectPr>
       <w:pgSz w:w="11906" w:h="16838" w:orient="portrait"/>
-      <w:pgMar w:top="850" w:right="1080" w:bottom="850" w:left="1080" w:header="708" w:footer="708" w:gutter="0"/>
+      <w:pgMar w:top="720" w:right="900" w:bottom="720" w:left="900" w:header="708" w:footer="708" w:gutter="0"/>
       <w:pgNumType/>
       <w:docGrid w:linePitch="360"/>
     </w:sectPr>
@@ -1670,12 +1739,6 @@
   </w:abstractNum>
   <w:num w:numId="1">
     <w:abstractNumId w:val="1"/>
-    <w:lvlOverride w:ilvl="0">
-      <w:startOverride w:val="1"/>
-    </w:lvlOverride>
-  </w:num>
-  <w:num w:numId="2">
-    <w:abstractNumId w:val="2"/>
     <w:lvlOverride w:ilvl="0">
       <w:startOverride w:val="1"/>
     </w:lvlOverride>

</xml_diff>

<commit_message>
Fill in semester projects 1–3, remove duplicate 4th-semester card
Adds the pencil-plotter (S1) and UR5 LEGO gripper (S2) projects and expands
the DTMF mobile robot entry (S3) with ROS 2 and measured results, written from
the report sources. Word CVs keep the five main projects and fit two pages.

Co-Authored-By: Claude Fable 5.1 <noreply@anthropic.com>
</commit_message>
<xml_diff>
--- a/public/Phillip_Christopher_Faerch_CV.docx
+++ b/public/Phillip_Christopher_Faerch_CV.docx
@@ -43,7 +43,7 @@
         </w:rPr>
         <w:t xml:space="preserve">Address: Nyborgvej 103, 2. tv., 5000 Odense C   ·   +45 22 18 77 00   ·   </w:t>
       </w:r>
-      <w:hyperlink w:history="1" r:id="rId7lsv3ytyy6hvmopbwpova">
+      <w:hyperlink w:history="1" r:id="rIdg1pzkjjehpkhpjx6aanaf">
         <w:r>
           <w:rPr>
             <w:rFonts w:ascii="Calibri" w:cs="Calibri" w:eastAsia="Calibri" w:hAnsi="Calibri"/>
@@ -69,7 +69,7 @@
         </w:rPr>
         <w:t xml:space="preserve">Born: 15 January 2002   ·   GitHub: </w:t>
       </w:r>
-      <w:hyperlink w:history="1" r:id="rId-agr11vuffyrw72bwd-zw">
+      <w:hyperlink w:history="1" r:id="rIdvd-s5r8ug8h4cs20owjic">
         <w:r>
           <w:rPr>
             <w:rFonts w:ascii="Calibri" w:cs="Calibri" w:eastAsia="Calibri" w:hAnsi="Calibri"/>
@@ -675,7 +675,7 @@
         </w:rPr>
         <w:t xml:space="preserve">   ·   Repository: </w:t>
       </w:r>
-      <w:hyperlink w:history="1" r:id="rIdh-ei7dwxgbdmedbnggdcu">
+      <w:hyperlink w:history="1" r:id="rIdqetelt2aj3migop1wnwlg">
         <w:r>
           <w:rPr>
             <w:rFonts w:ascii="Calibri" w:cs="Calibri" w:eastAsia="Calibri" w:hAnsi="Calibri"/>
@@ -766,7 +766,7 @@
         </w:rPr>
         <w:t xml:space="preserve">   ·   Repository: </w:t>
       </w:r>
-      <w:hyperlink w:history="1" r:id="rIdv_5rvtotj11osvcn7xdfv">
+      <w:hyperlink w:history="1" r:id="rIdu4-rdwh-gavtp_scsyjzj">
         <w:r>
           <w:rPr>
             <w:rFonts w:ascii="Calibri" w:cs="Calibri" w:eastAsia="Calibri" w:hAnsi="Calibri"/>
@@ -795,7 +795,7 @@
           <w:sz w:val="22"/>
           <w:szCs w:val="22"/>
         </w:rPr>
-        <w:t xml:space="preserve">Mobile robot controlled by audio tones (DTMF)</w:t>
+        <w:t xml:space="preserve">Mobile robot commanded by audio tones (DTMF)</w:t>
       </w:r>
       <w:r>
         <w:rPr>
@@ -832,7 +832,7 @@
           <w:sz w:val="20"/>
           <w:szCs w:val="20"/>
         </w:rPr>
-        <w:t xml:space="preserve">A TurtleBot3 Burger driven over sound: commands are encoded as DTMF tones, played from a PC and decoded on the robot with the Goertzel algorithm. The C++ stack is split into physical, data-link, transport and application layers with CRC error detection and timers for retransmission, mirroring a classic network protocol stack. Fully Doxygen-documented.</w:t>
+        <w:t xml:space="preserve">A TurtleBot3 Burger that executes paths sent to it as sound. A GUI builds the path, a self-designed half-duplex protocol encodes it as DTMF tones, and the robot decodes them in real time with the Goertzel algorithm and drives the route through ROS 2. The C++ code follows a four-layer architecture inspired by TCP/IP (physical, data link, transport, application) with CRC error detection, acknowledgements and retransmission timers. Verified reliable with up to 60 dBA background noise; 100 bits transferred in 4.4 s.</w:t>
       </w:r>
     </w:p>
     <w:p>
@@ -846,7 +846,7 @@
           <w:sz w:val="19"/>
           <w:szCs w:val="19"/>
         </w:rPr>
-        <w:t xml:space="preserve">C++ · Signal processing · Goertzel / FFT · Protocol design · TurtleBot3 · PortAudio · Doxygen</w:t>
+        <w:t xml:space="preserve">C++ · ROS 2 · Signal processing · Goertzel · Protocol design · Software architecture · TurtleBot3 · Doxygen</w:t>
       </w:r>
       <w:r>
         <w:rPr>
@@ -857,7 +857,7 @@
         </w:rPr>
         <w:t xml:space="preserve">   ·   Repository: </w:t>
       </w:r>
-      <w:hyperlink w:history="1" r:id="rIdnyj8h31nas3tcnv2z-jqs">
+      <w:hyperlink w:history="1" r:id="rIdrsv9zmlnzqoobe2mfeldt">
         <w:r>
           <w:rPr>
             <w:rFonts w:ascii="Calibri" w:cs="Calibri" w:eastAsia="Calibri" w:hAnsi="Calibri"/>

</xml_diff>

<commit_message>
Correct project contexts: drop Helios mention, exoskeleton is a master class project
Co-Authored-By: Claude Fable 5.1 <noreply@anthropic.com>
</commit_message>
<xml_diff>
--- a/public/Phillip_Christopher_Faerch_CV.docx
+++ b/public/Phillip_Christopher_Faerch_CV.docx
@@ -43,7 +43,7 @@
         </w:rPr>
         <w:t xml:space="preserve">Address: Nyborgvej 103, 2. tv., 5000 Odense C   ·   +45 22 18 77 00   ·   </w:t>
       </w:r>
-      <w:hyperlink w:history="1" r:id="rIdg1pzkjjehpkhpjx6aanaf">
+      <w:hyperlink w:history="1" r:id="rId4tfpdgguv3u3z256zkftm">
         <w:r>
           <w:rPr>
             <w:rFonts w:ascii="Calibri" w:cs="Calibri" w:eastAsia="Calibri" w:hAnsi="Calibri"/>
@@ -69,7 +69,7 @@
         </w:rPr>
         <w:t xml:space="preserve">Born: 15 January 2002   ·   GitHub: </w:t>
       </w:r>
-      <w:hyperlink w:history="1" r:id="rIdvd-s5r8ug8h4cs20owjic">
+      <w:hyperlink w:history="1" r:id="rId4cmzgiouafm4uafyoga4w">
         <w:r>
           <w:rPr>
             <w:rFonts w:ascii="Calibri" w:cs="Calibri" w:eastAsia="Calibri" w:hAnsi="Calibri"/>
@@ -675,7 +675,7 @@
         </w:rPr>
         <w:t xml:space="preserve">   ·   Repository: </w:t>
       </w:r>
-      <w:hyperlink w:history="1" r:id="rIdqetelt2aj3migop1wnwlg">
+      <w:hyperlink w:history="1" r:id="rIdjhca34pbmjadgccajueki">
         <w:r>
           <w:rPr>
             <w:rFonts w:ascii="Calibri" w:cs="Calibri" w:eastAsia="Calibri" w:hAnsi="Calibri"/>
@@ -766,7 +766,7 @@
         </w:rPr>
         <w:t xml:space="preserve">   ·   Repository: </w:t>
       </w:r>
-      <w:hyperlink w:history="1" r:id="rIdu4-rdwh-gavtp_scsyjzj">
+      <w:hyperlink w:history="1" r:id="rIdgnr7rpgtcl1bsusnsgr1x">
         <w:r>
           <w:rPr>
             <w:rFonts w:ascii="Calibri" w:cs="Calibri" w:eastAsia="Calibri" w:hAnsi="Calibri"/>
@@ -857,7 +857,7 @@
         </w:rPr>
         <w:t xml:space="preserve">   ·   Repository: </w:t>
       </w:r>
-      <w:hyperlink w:history="1" r:id="rIdrsv9zmlnzqoobe2mfeldt">
+      <w:hyperlink w:history="1" r:id="rId_ncj7wmhot0v0qn-avmuw">
         <w:r>
           <w:rPr>
             <w:rFonts w:ascii="Calibri" w:cs="Calibri" w:eastAsia="Calibri" w:hAnsi="Calibri"/>
@@ -909,7 +909,7 @@
           <w:sz w:val="20"/>
           <w:szCs w:val="20"/>
         </w:rPr>
-        <w:t xml:space="preserve">Ongoing personal research project · 2026</w:t>
+        <w:t xml:space="preserve">Master class: Adaptive Embodied Control Systems · SDU · 2026</w:t>
       </w:r>
     </w:p>
     <w:p>
@@ -979,7 +979,7 @@
           <w:sz w:val="20"/>
           <w:szCs w:val="20"/>
         </w:rPr>
-        <w:t xml:space="preserve">Personal project · 2025–present · part of the Helios project</w:t>
+        <w:t xml:space="preserve">Personal project · 2025–present</w:t>
       </w:r>
     </w:p>
     <w:p>
@@ -1539,20 +1539,6 @@
           <w:szCs w:val="20"/>
         </w:rPr>
         <w:t xml:space="preserve">Danish – Native   ·   English – Professional (studies taught in English)</w:t>
-      </w:r>
-    </w:p>
-    <w:p>
-      <w:pPr>
-        <w:spacing w:before="240"/>
-      </w:pPr>
-      <w:r>
-        <w:rPr>
-          <w:rFonts w:ascii="Calibri" w:cs="Calibri" w:eastAsia="Calibri" w:hAnsi="Calibri"/>
-          <w:color w:val="6F665C"/>
-          <w:sz w:val="17"/>
-          <w:szCs w:val="17"/>
-        </w:rPr>
-        <w:t xml:space="preserve">Last updated 2026-09-30</w:t>
       </w:r>
     </w:p>
     <w:sectPr>

</xml_diff>

<commit_message>
Order projects: master class, semesters 4 to 1, Ignis, CardCol
Co-Authored-By: Claude Fable 5.1 <noreply@anthropic.com>
</commit_message>
<xml_diff>
--- a/public/Phillip_Christopher_Faerch_CV.docx
+++ b/public/Phillip_Christopher_Faerch_CV.docx
@@ -43,7 +43,7 @@
         </w:rPr>
         <w:t xml:space="preserve">Address: Nyborgvej 103, 2. tv., 5000 Odense C   ·   +45 22 18 77 00   ·   </w:t>
       </w:r>
-      <w:hyperlink w:history="1" r:id="rId4tfpdgguv3u3z256zkftm">
+      <w:hyperlink w:history="1" r:id="rIdn8sxlsbj2kopm5jyfjxqo">
         <w:r>
           <w:rPr>
             <w:rFonts w:ascii="Calibri" w:cs="Calibri" w:eastAsia="Calibri" w:hAnsi="Calibri"/>
@@ -69,7 +69,7 @@
         </w:rPr>
         <w:t xml:space="preserve">Born: 15 January 2002   ·   GitHub: </w:t>
       </w:r>
-      <w:hyperlink w:history="1" r:id="rId4cmzgiouafm4uafyoga4w">
+      <w:hyperlink w:history="1" r:id="rIdrbod8wjdadao_srnigxtz">
         <w:r>
           <w:rPr>
             <w:rFonts w:ascii="Calibri" w:cs="Calibri" w:eastAsia="Calibri" w:hAnsi="Calibri"/>
@@ -675,7 +675,7 @@
         </w:rPr>
         <w:t xml:space="preserve">   ·   Repository: </w:t>
       </w:r>
-      <w:hyperlink w:history="1" r:id="rIdjhca34pbmjadgccajueki">
+      <w:hyperlink w:history="1" r:id="rIdiy3hyreap0iq7vxl-hukq">
         <w:r>
           <w:rPr>
             <w:rFonts w:ascii="Calibri" w:cs="Calibri" w:eastAsia="Calibri" w:hAnsi="Calibri"/>
@@ -704,6 +704,76 @@
           <w:sz w:val="22"/>
           <w:szCs w:val="22"/>
         </w:rPr>
+        <w:t xml:space="preserve">EMG-driven finger exoskeleton for tremor suppression</w:t>
+      </w:r>
+      <w:r>
+        <w:rPr>
+          <w:rFonts w:ascii="Calibri" w:cs="Calibri" w:eastAsia="Calibri" w:hAnsi="Calibri"/>
+          <w:color w:val="6F665C"/>
+          <w:sz w:val="19"/>
+          <w:szCs w:val="19"/>
+        </w:rPr>
+        <w:t xml:space="preserve">	</w:t>
+      </w:r>
+    </w:p>
+    <w:p>
+      <w:pPr>
+        <w:spacing w:after="40"/>
+      </w:pPr>
+      <w:r>
+        <w:rPr>
+          <w:rFonts w:ascii="Calibri" w:cs="Calibri" w:eastAsia="Calibri" w:hAnsi="Calibri"/>
+          <w:color w:val="6F665C"/>
+          <w:sz w:val="20"/>
+          <w:szCs w:val="20"/>
+        </w:rPr>
+        <w:t xml:space="preserve">Master class: Adaptive Embodied Control Systems · SDU · 2026</w:t>
+      </w:r>
+    </w:p>
+    <w:p>
+      <w:pPr>
+        <w:spacing w:after="60"/>
+      </w:pPr>
+      <w:r>
+        <w:rPr>
+          <w:rFonts w:ascii="Calibri" w:cs="Calibri" w:eastAsia="Calibri" w:hAnsi="Calibri"/>
+          <w:color w:val="2B2620"/>
+          <w:sz w:val="20"/>
+          <w:szCs w:val="20"/>
+        </w:rPr>
+        <w:t xml:space="preserve">A 2-DOF thumb–index hand exoskeleton concept for Parkinsonian tremor. Surface EMG is processed in Python to separate voluntary grasp intent from tremor-band muscle activity, so that adaptive stiffness or damping is applied only while tremor is present and natural movement is preserved.</w:t>
+      </w:r>
+    </w:p>
+    <w:p>
+      <w:pPr>
+        <w:spacing w:after="60"/>
+      </w:pPr>
+      <w:r>
+        <w:rPr>
+          <w:rFonts w:ascii="Calibri" w:cs="Calibri" w:eastAsia="Calibri" w:hAnsi="Calibri"/>
+          <w:color w:val="6F665C"/>
+          <w:sz w:val="19"/>
+          <w:szCs w:val="19"/>
+        </w:rPr>
+        <w:t xml:space="preserve">Python · Signal processing · EMG · Biomechatronics</w:t>
+      </w:r>
+    </w:p>
+    <w:p>
+      <w:pPr>
+        <w:tabs>
+          <w:tab w:val="right" w:pos="10106"/>
+        </w:tabs>
+        <w:spacing w:after="10" w:before="90"/>
+      </w:pPr>
+      <w:r>
+        <w:rPr>
+          <w:rFonts w:ascii="Calibri" w:cs="Calibri" w:eastAsia="Calibri" w:hAnsi="Calibri"/>
+          <w:b/>
+          <w:bCs/>
+          <w:color w:val="2B2620"/>
+          <w:sz w:val="22"/>
+          <w:szCs w:val="22"/>
+        </w:rPr>
         <w:t xml:space="preserve">Pan-tilt control system with ball tracking</w:t>
       </w:r>
       <w:r>
@@ -766,7 +836,7 @@
         </w:rPr>
         <w:t xml:space="preserve">   ·   Repository: </w:t>
       </w:r>
-      <w:hyperlink w:history="1" r:id="rIdgnr7rpgtcl1bsusnsgr1x">
+      <w:hyperlink w:history="1" r:id="rIdn6qkzncqubgxfqmtgxk77">
         <w:r>
           <w:rPr>
             <w:rFonts w:ascii="Calibri" w:cs="Calibri" w:eastAsia="Calibri" w:hAnsi="Calibri"/>
@@ -857,7 +927,7 @@
         </w:rPr>
         <w:t xml:space="preserve">   ·   Repository: </w:t>
       </w:r>
-      <w:hyperlink w:history="1" r:id="rId_ncj7wmhot0v0qn-avmuw">
+      <w:hyperlink w:history="1" r:id="rId2ur7fkkoevs3xw33vpqus">
         <w:r>
           <w:rPr>
             <w:rFonts w:ascii="Calibri" w:cs="Calibri" w:eastAsia="Calibri" w:hAnsi="Calibri"/>
@@ -869,76 +939,6 @@
           <w:t xml:space="preserve">github.com/Toasting-Snowdragon-9999/Mobile_robotsystem</w:t>
         </w:r>
       </w:hyperlink>
-    </w:p>
-    <w:p>
-      <w:pPr>
-        <w:tabs>
-          <w:tab w:val="right" w:pos="10106"/>
-        </w:tabs>
-        <w:spacing w:after="10" w:before="90"/>
-      </w:pPr>
-      <w:r>
-        <w:rPr>
-          <w:rFonts w:ascii="Calibri" w:cs="Calibri" w:eastAsia="Calibri" w:hAnsi="Calibri"/>
-          <w:b/>
-          <w:bCs/>
-          <w:color w:val="2B2620"/>
-          <w:sz w:val="22"/>
-          <w:szCs w:val="22"/>
-        </w:rPr>
-        <w:t xml:space="preserve">EMG-driven finger exoskeleton for tremor suppression</w:t>
-      </w:r>
-      <w:r>
-        <w:rPr>
-          <w:rFonts w:ascii="Calibri" w:cs="Calibri" w:eastAsia="Calibri" w:hAnsi="Calibri"/>
-          <w:color w:val="6F665C"/>
-          <w:sz w:val="19"/>
-          <w:szCs w:val="19"/>
-        </w:rPr>
-        <w:t xml:space="preserve">	</w:t>
-      </w:r>
-    </w:p>
-    <w:p>
-      <w:pPr>
-        <w:spacing w:after="40"/>
-      </w:pPr>
-      <w:r>
-        <w:rPr>
-          <w:rFonts w:ascii="Calibri" w:cs="Calibri" w:eastAsia="Calibri" w:hAnsi="Calibri"/>
-          <w:color w:val="6F665C"/>
-          <w:sz w:val="20"/>
-          <w:szCs w:val="20"/>
-        </w:rPr>
-        <w:t xml:space="preserve">Master class: Adaptive Embodied Control Systems · SDU · 2026</w:t>
-      </w:r>
-    </w:p>
-    <w:p>
-      <w:pPr>
-        <w:spacing w:after="60"/>
-      </w:pPr>
-      <w:r>
-        <w:rPr>
-          <w:rFonts w:ascii="Calibri" w:cs="Calibri" w:eastAsia="Calibri" w:hAnsi="Calibri"/>
-          <w:color w:val="2B2620"/>
-          <w:sz w:val="20"/>
-          <w:szCs w:val="20"/>
-        </w:rPr>
-        <w:t xml:space="preserve">A 2-DOF thumb–index hand exoskeleton concept for Parkinsonian tremor. Surface EMG is processed in Python to separate voluntary grasp intent from tremor-band muscle activity, so that adaptive stiffness or damping is applied only while tremor is present and natural movement is preserved.</w:t>
-      </w:r>
-    </w:p>
-    <w:p>
-      <w:pPr>
-        <w:spacing w:after="60"/>
-      </w:pPr>
-      <w:r>
-        <w:rPr>
-          <w:rFonts w:ascii="Calibri" w:cs="Calibri" w:eastAsia="Calibri" w:hAnsi="Calibri"/>
-          <w:color w:val="6F665C"/>
-          <w:sz w:val="19"/>
-          <w:szCs w:val="19"/>
-        </w:rPr>
-        <w:t xml:space="preserve">Python · Signal processing · EMG · Biomechatronics</w:t>
-      </w:r>
     </w:p>
     <w:p>
       <w:pPr>

</xml_diff>

<commit_message>
Skills: add Bitbucket, testing tools, Linux, and team experience at 4X-Robots
Co-Authored-By: Claude Fable 5.1 <noreply@anthropic.com>
</commit_message>
<xml_diff>
--- a/public/Phillip_Christopher_Faerch_CV.docx
+++ b/public/Phillip_Christopher_Faerch_CV.docx
@@ -43,7 +43,7 @@
         </w:rPr>
         <w:t xml:space="preserve">Address: Nyborgvej 103, 2. tv., 5000 Odense C   ·   +45 22 18 77 00   ·   </w:t>
       </w:r>
-      <w:hyperlink w:history="1" r:id="rIdn8sxlsbj2kopm5jyfjxqo">
+      <w:hyperlink w:history="1" r:id="rIdn7qsinammfcunw-9hkc1q">
         <w:r>
           <w:rPr>
             <w:rFonts w:ascii="Calibri" w:cs="Calibri" w:eastAsia="Calibri" w:hAnsi="Calibri"/>
@@ -69,7 +69,7 @@
         </w:rPr>
         <w:t xml:space="preserve">Born: 15 January 2002   ·   GitHub: </w:t>
       </w:r>
-      <w:hyperlink w:history="1" r:id="rIdrbod8wjdadao_srnigxtz">
+      <w:hyperlink w:history="1" r:id="rIddimkqk8gidjmhlldu0f07">
         <w:r>
           <w:rPr>
             <w:rFonts w:ascii="Calibri" w:cs="Calibri" w:eastAsia="Calibri" w:hAnsi="Calibri"/>
@@ -88,7 +88,7 @@
         <w:pBdr>
           <w:bottom w:val="single" w:color="D9D2C2" w:sz="6" w:space="4"/>
         </w:pBdr>
-        <w:spacing w:after="70" w:before="200"/>
+        <w:spacing w:after="60" w:before="170"/>
       </w:pPr>
       <w:r>
         <w:rPr>
@@ -104,7 +104,7 @@
     </w:p>
     <w:p>
       <w:pPr>
-        <w:spacing w:after="60"/>
+        <w:spacing w:after="50"/>
       </w:pPr>
       <w:r>
         <w:rPr>
@@ -122,7 +122,7 @@
         <w:pBdr>
           <w:bottom w:val="single" w:color="D9D2C2" w:sz="6" w:space="4"/>
         </w:pBdr>
-        <w:spacing w:after="70" w:before="200"/>
+        <w:spacing w:after="60" w:before="170"/>
       </w:pPr>
       <w:r>
         <w:rPr>
@@ -180,7 +180,7 @@
     </w:p>
     <w:p>
       <w:pPr>
-        <w:spacing w:after="60"/>
+        <w:spacing w:after="50"/>
       </w:pPr>
       <w:r>
         <w:rPr>
@@ -236,7 +236,7 @@
     </w:p>
     <w:p>
       <w:pPr>
-        <w:spacing w:after="60"/>
+        <w:spacing w:after="50"/>
       </w:pPr>
       <w:r>
         <w:rPr>
@@ -583,7 +583,7 @@
         <w:pBdr>
           <w:bottom w:val="single" w:color="D9D2C2" w:sz="6" w:space="4"/>
         </w:pBdr>
-        <w:spacing w:after="70" w:before="200"/>
+        <w:spacing w:after="60" w:before="170"/>
       </w:pPr>
       <w:r>
         <w:rPr>
@@ -641,25 +641,25 @@
     </w:p>
     <w:p>
       <w:pPr>
+        <w:spacing w:after="50"/>
+      </w:pPr>
+      <w:r>
+        <w:rPr>
+          <w:rFonts w:ascii="Calibri" w:cs="Calibri" w:eastAsia="Calibri" w:hAnsi="Calibri"/>
+          <w:color w:val="2B2620"/>
+          <w:sz w:val="20"/>
+          <w:szCs w:val="20"/>
+        </w:rPr>
+        <w:t xml:space="preserve">A locomotion controller for the Unitree Go2 quadruped in the MuJoCo physics simulator, built without a full-body dynamic model. Four coupled Kuramoto oscillators form a central pattern generator that sets the gait rhythm, foot trajectories are solved with Levenberg–Marquardt inverse kinematics, and joints are driven by a muscle-like adaptive impedance controller (OIAC). Gait parameters are tuned with PPO and CMA-ES.</w:t>
+      </w:r>
+    </w:p>
+    <w:p>
+      <w:pPr>
         <w:spacing w:after="60"/>
       </w:pPr>
       <w:r>
         <w:rPr>
           <w:rFonts w:ascii="Calibri" w:cs="Calibri" w:eastAsia="Calibri" w:hAnsi="Calibri"/>
-          <w:color w:val="2B2620"/>
-          <w:sz w:val="20"/>
-          <w:szCs w:val="20"/>
-        </w:rPr>
-        <w:t xml:space="preserve">A locomotion controller for the Unitree Go2 quadruped in the MuJoCo physics simulator, built without a full-body dynamic model. Four coupled Kuramoto oscillators form a central pattern generator that sets the gait rhythm, foot trajectories are solved with Levenberg–Marquardt inverse kinematics, and joints are driven by a muscle-like adaptive impedance controller (OIAC). Gait parameters are tuned with PPO and CMA-ES.</w:t>
-      </w:r>
-    </w:p>
-    <w:p>
-      <w:pPr>
-        <w:spacing w:after="60"/>
-      </w:pPr>
-      <w:r>
-        <w:rPr>
-          <w:rFonts w:ascii="Calibri" w:cs="Calibri" w:eastAsia="Calibri" w:hAnsi="Calibri"/>
           <w:color w:val="6F665C"/>
           <w:sz w:val="19"/>
           <w:szCs w:val="19"/>
@@ -675,7 +675,7 @@
         </w:rPr>
         <w:t xml:space="preserve">   ·   Repository: </w:t>
       </w:r>
-      <w:hyperlink w:history="1" r:id="rIdiy3hyreap0iq7vxl-hukq">
+      <w:hyperlink w:history="1" r:id="rIddlxx8t64c1y7k4ikgzd9n">
         <w:r>
           <w:rPr>
             <w:rFonts w:ascii="Calibri" w:cs="Calibri" w:eastAsia="Calibri" w:hAnsi="Calibri"/>
@@ -732,7 +732,7 @@
     </w:p>
     <w:p>
       <w:pPr>
-        <w:spacing w:after="60"/>
+        <w:spacing w:after="50"/>
       </w:pPr>
       <w:r>
         <w:rPr>
@@ -802,25 +802,25 @@
     </w:p>
     <w:p>
       <w:pPr>
+        <w:spacing w:after="50"/>
+      </w:pPr>
+      <w:r>
+        <w:rPr>
+          <w:rFonts w:ascii="Calibri" w:cs="Calibri" w:eastAsia="Calibri" w:hAnsi="Calibri"/>
+          <w:color w:val="2B2620"/>
+          <w:sz w:val="20"/>
+          <w:szCs w:val="20"/>
+        </w:rPr>
+        <w:t xml:space="preserve">Closed-loop control of a two-axis pan-tilt camera platform. A Tiva TM4C123 microcontroller running FreeRTOS executes the control loops and talks over SPI to a PYNQ-Z2 FPGA, where VHDL modules generate motor PWM and decode the encoders. An OpenCV pipeline in C++ detects a tennis ball and feeds its position to the controller so the platform follows it.</w:t>
+      </w:r>
+    </w:p>
+    <w:p>
+      <w:pPr>
         <w:spacing w:after="60"/>
       </w:pPr>
       <w:r>
         <w:rPr>
           <w:rFonts w:ascii="Calibri" w:cs="Calibri" w:eastAsia="Calibri" w:hAnsi="Calibri"/>
-          <w:color w:val="2B2620"/>
-          <w:sz w:val="20"/>
-          <w:szCs w:val="20"/>
-        </w:rPr>
-        <w:t xml:space="preserve">Closed-loop control of a two-axis pan-tilt camera platform. A Tiva TM4C123 microcontroller running FreeRTOS executes the control loops and talks over SPI to a PYNQ-Z2 FPGA, where VHDL modules generate motor PWM and decode the encoders. An OpenCV pipeline in C++ detects a tennis ball and feeds its position to the controller so the platform follows it.</w:t>
-      </w:r>
-    </w:p>
-    <w:p>
-      <w:pPr>
-        <w:spacing w:after="60"/>
-      </w:pPr>
-      <w:r>
-        <w:rPr>
-          <w:rFonts w:ascii="Calibri" w:cs="Calibri" w:eastAsia="Calibri" w:hAnsi="Calibri"/>
           <w:color w:val="6F665C"/>
           <w:sz w:val="19"/>
           <w:szCs w:val="19"/>
@@ -836,7 +836,7 @@
         </w:rPr>
         <w:t xml:space="preserve">   ·   Repository: </w:t>
       </w:r>
-      <w:hyperlink w:history="1" r:id="rIdn6qkzncqubgxfqmtgxk77">
+      <w:hyperlink w:history="1" r:id="rIdqt-wynynppnz2w9bgvndb">
         <w:r>
           <w:rPr>
             <w:rFonts w:ascii="Calibri" w:cs="Calibri" w:eastAsia="Calibri" w:hAnsi="Calibri"/>
@@ -893,25 +893,25 @@
     </w:p>
     <w:p>
       <w:pPr>
+        <w:spacing w:after="50"/>
+      </w:pPr>
+      <w:r>
+        <w:rPr>
+          <w:rFonts w:ascii="Calibri" w:cs="Calibri" w:eastAsia="Calibri" w:hAnsi="Calibri"/>
+          <w:color w:val="2B2620"/>
+          <w:sz w:val="20"/>
+          <w:szCs w:val="20"/>
+        </w:rPr>
+        <w:t xml:space="preserve">A TurtleBot3 Burger that executes paths sent to it as sound. A GUI builds the path, a self-designed half-duplex protocol encodes it as DTMF tones, and the robot decodes them in real time with the Goertzel algorithm and drives the route through ROS 2. The C++ code follows a four-layer architecture inspired by TCP/IP (physical, data link, transport, application) with CRC error detection, acknowledgements and retransmission timers. Verified reliable with up to 60 dBA background noise; 100 bits transferred in 4.4 s.</w:t>
+      </w:r>
+    </w:p>
+    <w:p>
+      <w:pPr>
         <w:spacing w:after="60"/>
       </w:pPr>
       <w:r>
         <w:rPr>
           <w:rFonts w:ascii="Calibri" w:cs="Calibri" w:eastAsia="Calibri" w:hAnsi="Calibri"/>
-          <w:color w:val="2B2620"/>
-          <w:sz w:val="20"/>
-          <w:szCs w:val="20"/>
-        </w:rPr>
-        <w:t xml:space="preserve">A TurtleBot3 Burger that executes paths sent to it as sound. A GUI builds the path, a self-designed half-duplex protocol encodes it as DTMF tones, and the robot decodes them in real time with the Goertzel algorithm and drives the route through ROS 2. The C++ code follows a four-layer architecture inspired by TCP/IP (physical, data link, transport, application) with CRC error detection, acknowledgements and retransmission timers. Verified reliable with up to 60 dBA background noise; 100 bits transferred in 4.4 s.</w:t>
-      </w:r>
-    </w:p>
-    <w:p>
-      <w:pPr>
-        <w:spacing w:after="60"/>
-      </w:pPr>
-      <w:r>
-        <w:rPr>
-          <w:rFonts w:ascii="Calibri" w:cs="Calibri" w:eastAsia="Calibri" w:hAnsi="Calibri"/>
           <w:color w:val="6F665C"/>
           <w:sz w:val="19"/>
           <w:szCs w:val="19"/>
@@ -927,7 +927,7 @@
         </w:rPr>
         <w:t xml:space="preserve">   ·   Repository: </w:t>
       </w:r>
-      <w:hyperlink w:history="1" r:id="rId2ur7fkkoevs3xw33vpqus">
+      <w:hyperlink w:history="1" r:id="rIdqjs1do0kmdzfa2iftnzmx">
         <w:r>
           <w:rPr>
             <w:rFonts w:ascii="Calibri" w:cs="Calibri" w:eastAsia="Calibri" w:hAnsi="Calibri"/>
@@ -984,7 +984,7 @@
     </w:p>
     <w:p>
       <w:pPr>
-        <w:spacing w:after="60"/>
+        <w:spacing w:after="50"/>
       </w:pPr>
       <w:r>
         <w:rPr>
@@ -1016,7 +1016,7 @@
         <w:pBdr>
           <w:bottom w:val="single" w:color="D9D2C2" w:sz="6" w:space="4"/>
         </w:pBdr>
-        <w:spacing w:after="70" w:before="200"/>
+        <w:spacing w:after="60" w:before="170"/>
       </w:pPr>
       <w:r>
         <w:rPr>
@@ -1069,7 +1069,7 @@
     </w:p>
     <w:p>
       <w:pPr>
-        <w:spacing w:after="60"/>
+        <w:spacing w:after="50"/>
       </w:pPr>
       <w:r>
         <w:rPr>
@@ -1120,7 +1120,7 @@
     </w:p>
     <w:p>
       <w:pPr>
-        <w:spacing w:after="60"/>
+        <w:spacing w:after="50"/>
       </w:pPr>
       <w:r>
         <w:rPr>
@@ -1171,7 +1171,7 @@
     </w:p>
     <w:p>
       <w:pPr>
-        <w:spacing w:after="60"/>
+        <w:spacing w:after="50"/>
       </w:pPr>
       <w:r>
         <w:rPr>
@@ -1222,7 +1222,7 @@
     </w:p>
     <w:p>
       <w:pPr>
-        <w:spacing w:after="60"/>
+        <w:spacing w:after="50"/>
       </w:pPr>
       <w:r>
         <w:rPr>
@@ -1273,7 +1273,7 @@
     </w:p>
     <w:p>
       <w:pPr>
-        <w:spacing w:after="60"/>
+        <w:spacing w:after="50"/>
       </w:pPr>
       <w:r>
         <w:rPr>
@@ -1324,7 +1324,7 @@
     </w:p>
     <w:p>
       <w:pPr>
-        <w:spacing w:after="60"/>
+        <w:spacing w:after="50"/>
       </w:pPr>
       <w:r>
         <w:rPr>
@@ -1375,7 +1375,7 @@
     </w:p>
     <w:p>
       <w:pPr>
-        <w:spacing w:after="60"/>
+        <w:spacing w:after="50"/>
       </w:pPr>
       <w:r>
         <w:rPr>
@@ -1393,7 +1393,7 @@
         <w:pBdr>
           <w:bottom w:val="single" w:color="D9D2C2" w:sz="6" w:space="4"/>
         </w:pBdr>
-        <w:spacing w:after="70" w:before="200"/>
+        <w:spacing w:after="60" w:before="170"/>
       </w:pPr>
       <w:r>
         <w:rPr>
@@ -1479,7 +1479,7 @@
           <w:sz w:val="20"/>
           <w:szCs w:val="20"/>
         </w:rPr>
-        <w:t xml:space="preserve">Python (NumPy, SciPy, Gymnasium, Stable-Baselines3), C++ (CMake), MATLAB, OpenCV, Reinforcement learning (PPO, Q-learning), Signal processing &amp; EMG, Git, GitHub, LaTeX</w:t>
+        <w:t xml:space="preserve">Python (NumPy, SciPy, Gymnasium, Stable-Baselines3), C++ (CMake), MATLAB, OpenCV, Reinforcement learning (PPO, Q-learning), Signal processing &amp; EMG, Git, GitHub, Bitbucket, LaTeX, Testing &amp; code quality: pytest, mypy, flake8, pylint, Linux (Ubuntu &amp; Arch), Windows</w:t>
       </w:r>
     </w:p>
     <w:p>
@@ -1504,7 +1504,7 @@
           <w:sz w:val="20"/>
           <w:szCs w:val="20"/>
         </w:rPr>
-        <w:t xml:space="preserve">Project work in small teams every semester, Report writing and oral defence, Curious, thorough, hands-on</w:t>
+        <w:t xml:space="preserve">Part of an eight-person development team on a large codebase at 4X-Robots, Project work in small teams every semester, Report writing and oral defence, Curious, thorough, hands-on</w:t>
       </w:r>
     </w:p>
     <w:p>
@@ -1513,7 +1513,7 @@
         <w:pBdr>
           <w:bottom w:val="single" w:color="D9D2C2" w:sz="6" w:space="4"/>
         </w:pBdr>
-        <w:spacing w:after="70" w:before="200"/>
+        <w:spacing w:after="60" w:before="170"/>
       </w:pPr>
       <w:r>
         <w:rPr>

</xml_diff>

<commit_message>
Skills: ways of working first, robotics & control last
Co-Authored-By: Claude Fable 5.1 <noreply@anthropic.com>
</commit_message>
<xml_diff>
--- a/public/Phillip_Christopher_Faerch_CV.docx
+++ b/public/Phillip_Christopher_Faerch_CV.docx
@@ -43,7 +43,7 @@
         </w:rPr>
         <w:t xml:space="preserve">Address: Nyborgvej 103, 2. tv., 5000 Odense C   ·   +45 22 18 77 00   ·   </w:t>
       </w:r>
-      <w:hyperlink w:history="1" r:id="rIdn7qsinammfcunw-9hkc1q">
+      <w:hyperlink w:history="1" r:id="rIdvpsujonl_r83d3pcacqhu">
         <w:r>
           <w:rPr>
             <w:rFonts w:ascii="Calibri" w:cs="Calibri" w:eastAsia="Calibri" w:hAnsi="Calibri"/>
@@ -69,7 +69,7 @@
         </w:rPr>
         <w:t xml:space="preserve">Born: 15 January 2002   ·   GitHub: </w:t>
       </w:r>
-      <w:hyperlink w:history="1" r:id="rIddimkqk8gidjmhlldu0f07">
+      <w:hyperlink w:history="1" r:id="rIdc2dsxqkv6gzteclmzdf2o">
         <w:r>
           <w:rPr>
             <w:rFonts w:ascii="Calibri" w:cs="Calibri" w:eastAsia="Calibri" w:hAnsi="Calibri"/>
@@ -675,7 +675,7 @@
         </w:rPr>
         <w:t xml:space="preserve">   ·   Repository: </w:t>
       </w:r>
-      <w:hyperlink w:history="1" r:id="rIddlxx8t64c1y7k4ikgzd9n">
+      <w:hyperlink w:history="1" r:id="rIdhikvxznskrv2bvyzqpwol">
         <w:r>
           <w:rPr>
             <w:rFonts w:ascii="Calibri" w:cs="Calibri" w:eastAsia="Calibri" w:hAnsi="Calibri"/>
@@ -836,7 +836,7 @@
         </w:rPr>
         <w:t xml:space="preserve">   ·   Repository: </w:t>
       </w:r>
-      <w:hyperlink w:history="1" r:id="rIdqt-wynynppnz2w9bgvndb">
+      <w:hyperlink w:history="1" r:id="rId0jfvwtcg5xufljwhanynt">
         <w:r>
           <w:rPr>
             <w:rFonts w:ascii="Calibri" w:cs="Calibri" w:eastAsia="Calibri" w:hAnsi="Calibri"/>
@@ -927,7 +927,7 @@
         </w:rPr>
         <w:t xml:space="preserve">   ·   Repository: </w:t>
       </w:r>
-      <w:hyperlink w:history="1" r:id="rIdqjs1do0kmdzfa2iftnzmx">
+      <w:hyperlink w:history="1" r:id="rId1_8hz5xxvzutpfwp3b6eu">
         <w:r>
           <w:rPr>
             <w:rFonts w:ascii="Calibri" w:cs="Calibri" w:eastAsia="Calibri" w:hAnsi="Calibri"/>
@@ -1420,6 +1420,81 @@
           <w:sz w:val="20"/>
           <w:szCs w:val="20"/>
         </w:rPr>
+        <w:t xml:space="preserve">Ways of working: </w:t>
+      </w:r>
+      <w:r>
+        <w:rPr>
+          <w:rFonts w:ascii="Calibri" w:cs="Calibri" w:eastAsia="Calibri" w:hAnsi="Calibri"/>
+          <w:color w:val="2B2620"/>
+          <w:sz w:val="20"/>
+          <w:szCs w:val="20"/>
+        </w:rPr>
+        <w:t xml:space="preserve">Part of an eight-person development team on a large codebase at 4X-Robots, Project work in small teams every semester, Report writing and oral defence, Curious, thorough, hands-on</w:t>
+      </w:r>
+    </w:p>
+    <w:p>
+      <w:pPr>
+        <w:spacing w:after="50"/>
+      </w:pPr>
+      <w:r>
+        <w:rPr>
+          <w:rFonts w:ascii="Calibri" w:cs="Calibri" w:eastAsia="Calibri" w:hAnsi="Calibri"/>
+          <w:b/>
+          <w:bCs/>
+          <w:color w:val="2B2620"/>
+          <w:sz w:val="20"/>
+          <w:szCs w:val="20"/>
+        </w:rPr>
+        <w:t xml:space="preserve">Embedded &amp; hardware: </w:t>
+      </w:r>
+      <w:r>
+        <w:rPr>
+          <w:rFonts w:ascii="Calibri" w:cs="Calibri" w:eastAsia="Calibri" w:hAnsi="Calibri"/>
+          <w:color w:val="2B2620"/>
+          <w:sz w:val="20"/>
+          <w:szCs w:val="20"/>
+        </w:rPr>
+        <w:t xml:space="preserve">C on ARM Cortex-M (Tiva TM4C123), FreeRTOS, VHDL / FPGA (PYNQ-Z2), SPI, UART, PWM, encoders, Basic analog &amp; digital electronics, Raspberry Pi Pico</w:t>
+      </w:r>
+    </w:p>
+    <w:p>
+      <w:pPr>
+        <w:spacing w:after="50"/>
+      </w:pPr>
+      <w:r>
+        <w:rPr>
+          <w:rFonts w:ascii="Calibri" w:cs="Calibri" w:eastAsia="Calibri" w:hAnsi="Calibri"/>
+          <w:b/>
+          <w:bCs/>
+          <w:color w:val="2B2620"/>
+          <w:sz w:val="20"/>
+          <w:szCs w:val="20"/>
+        </w:rPr>
+        <w:t xml:space="preserve">Software &amp; AI: </w:t>
+      </w:r>
+      <w:r>
+        <w:rPr>
+          <w:rFonts w:ascii="Calibri" w:cs="Calibri" w:eastAsia="Calibri" w:hAnsi="Calibri"/>
+          <w:color w:val="2B2620"/>
+          <w:sz w:val="20"/>
+          <w:szCs w:val="20"/>
+        </w:rPr>
+        <w:t xml:space="preserve">Python (NumPy, SciPy, Gymnasium, Stable-Baselines3), C++ (CMake), MATLAB, OpenCV, Reinforcement learning (PPO, Q-learning), Signal processing &amp; EMG, Git, GitHub, Bitbucket, LaTeX, Testing &amp; code quality: pytest, mypy, flake8, pylint, Linux (Ubuntu &amp; Arch), Windows</w:t>
+      </w:r>
+    </w:p>
+    <w:p>
+      <w:pPr>
+        <w:spacing w:after="50"/>
+      </w:pPr>
+      <w:r>
+        <w:rPr>
+          <w:rFonts w:ascii="Calibri" w:cs="Calibri" w:eastAsia="Calibri" w:hAnsi="Calibri"/>
+          <w:b/>
+          <w:bCs/>
+          <w:color w:val="2B2620"/>
+          <w:sz w:val="20"/>
+          <w:szCs w:val="20"/>
+        </w:rPr>
         <w:t xml:space="preserve">Robotics &amp; control: </w:t>
       </w:r>
       <w:r>
@@ -1430,81 +1505,6 @@
           <w:szCs w:val="20"/>
         </w:rPr>
         <w:t xml:space="preserve">Control theory (PID, state space, sliding mode), Robot kinematics &amp; inverse kinematics, Central pattern generators, Path planning (A*, bug algorithms), MuJoCo simulation, Underactuated systems</w:t>
-      </w:r>
-    </w:p>
-    <w:p>
-      <w:pPr>
-        <w:spacing w:after="50"/>
-      </w:pPr>
-      <w:r>
-        <w:rPr>
-          <w:rFonts w:ascii="Calibri" w:cs="Calibri" w:eastAsia="Calibri" w:hAnsi="Calibri"/>
-          <w:b/>
-          <w:bCs/>
-          <w:color w:val="2B2620"/>
-          <w:sz w:val="20"/>
-          <w:szCs w:val="20"/>
-        </w:rPr>
-        <w:t xml:space="preserve">Embedded &amp; hardware: </w:t>
-      </w:r>
-      <w:r>
-        <w:rPr>
-          <w:rFonts w:ascii="Calibri" w:cs="Calibri" w:eastAsia="Calibri" w:hAnsi="Calibri"/>
-          <w:color w:val="2B2620"/>
-          <w:sz w:val="20"/>
-          <w:szCs w:val="20"/>
-        </w:rPr>
-        <w:t xml:space="preserve">C on ARM Cortex-M (Tiva TM4C123), FreeRTOS, VHDL / FPGA (PYNQ-Z2), SPI, UART, PWM, encoders, Basic analog &amp; digital electronics, Raspberry Pi Pico</w:t>
-      </w:r>
-    </w:p>
-    <w:p>
-      <w:pPr>
-        <w:spacing w:after="50"/>
-      </w:pPr>
-      <w:r>
-        <w:rPr>
-          <w:rFonts w:ascii="Calibri" w:cs="Calibri" w:eastAsia="Calibri" w:hAnsi="Calibri"/>
-          <w:b/>
-          <w:bCs/>
-          <w:color w:val="2B2620"/>
-          <w:sz w:val="20"/>
-          <w:szCs w:val="20"/>
-        </w:rPr>
-        <w:t xml:space="preserve">Software &amp; AI: </w:t>
-      </w:r>
-      <w:r>
-        <w:rPr>
-          <w:rFonts w:ascii="Calibri" w:cs="Calibri" w:eastAsia="Calibri" w:hAnsi="Calibri"/>
-          <w:color w:val="2B2620"/>
-          <w:sz w:val="20"/>
-          <w:szCs w:val="20"/>
-        </w:rPr>
-        <w:t xml:space="preserve">Python (NumPy, SciPy, Gymnasium, Stable-Baselines3), C++ (CMake), MATLAB, OpenCV, Reinforcement learning (PPO, Q-learning), Signal processing &amp; EMG, Git, GitHub, Bitbucket, LaTeX, Testing &amp; code quality: pytest, mypy, flake8, pylint, Linux (Ubuntu &amp; Arch), Windows</w:t>
-      </w:r>
-    </w:p>
-    <w:p>
-      <w:pPr>
-        <w:spacing w:after="50"/>
-      </w:pPr>
-      <w:r>
-        <w:rPr>
-          <w:rFonts w:ascii="Calibri" w:cs="Calibri" w:eastAsia="Calibri" w:hAnsi="Calibri"/>
-          <w:b/>
-          <w:bCs/>
-          <w:color w:val="2B2620"/>
-          <w:sz w:val="20"/>
-          <w:szCs w:val="20"/>
-        </w:rPr>
-        <w:t xml:space="preserve">Ways of working: </w:t>
-      </w:r>
-      <w:r>
-        <w:rPr>
-          <w:rFonts w:ascii="Calibri" w:cs="Calibri" w:eastAsia="Calibri" w:hAnsi="Calibri"/>
-          <w:color w:val="2B2620"/>
-          <w:sz w:val="20"/>
-          <w:szCs w:val="20"/>
-        </w:rPr>
-        <w:t xml:space="preserve">Part of an eight-person development team on a large codebase at 4X-Robots, Project work in small teams every semester, Report writing and oral defence, Curious, thorough, hands-on</w:t>
       </w:r>
     </w:p>
     <w:p>

</xml_diff>

<commit_message>
Add LinkedIn, Languages section and new footer with icon links
Co-Authored-By: Claude Fable 5.1 <noreply@anthropic.com>
</commit_message>
<xml_diff>
--- a/public/Phillip_Christopher_Faerch_CV.docx
+++ b/public/Phillip_Christopher_Faerch_CV.docx
@@ -43,7 +43,7 @@
         </w:rPr>
         <w:t xml:space="preserve">Address: Nyborgvej 103, 2. tv., 5000 Odense C   ·   +45 22 18 77 00   ·   </w:t>
       </w:r>
-      <w:hyperlink w:history="1" r:id="rIdvpsujonl_r83d3pcacqhu">
+      <w:hyperlink w:history="1" r:id="rIder0u8frgq8ab34rohuw4o">
         <w:r>
           <w:rPr>
             <w:rFonts w:ascii="Calibri" w:cs="Calibri" w:eastAsia="Calibri" w:hAnsi="Calibri"/>
@@ -69,7 +69,7 @@
         </w:rPr>
         <w:t xml:space="preserve">Born: 15 January 2002   ·   GitHub: </w:t>
       </w:r>
-      <w:hyperlink w:history="1" r:id="rIdc2dsxqkv6gzteclmzdf2o">
+      <w:hyperlink w:history="1" r:id="rIdd0j1zg6b6m9tta-g-h3le">
         <w:r>
           <w:rPr>
             <w:rFonts w:ascii="Calibri" w:cs="Calibri" w:eastAsia="Calibri" w:hAnsi="Calibri"/>
@@ -81,6 +81,27 @@
           <w:t xml:space="preserve">Toasting-Snowdragon-9999</w:t>
         </w:r>
       </w:hyperlink>
+      <w:r>
+        <w:rPr>
+          <w:rFonts w:ascii="Calibri" w:cs="Calibri" w:eastAsia="Calibri" w:hAnsi="Calibri"/>
+          <w:color w:val="6F665C"/>
+          <w:sz w:val="20"/>
+          <w:szCs w:val="20"/>
+        </w:rPr>
+        <w:t xml:space="preserve">   ·   LinkedIn: </w:t>
+      </w:r>
+      <w:hyperlink w:history="1" r:id="rIduhszdnpa7lqt0kl73krbh">
+        <w:r>
+          <w:rPr>
+            <w:rFonts w:ascii="Calibri" w:cs="Calibri" w:eastAsia="Calibri" w:hAnsi="Calibri"/>
+            <w:color w:val="4E5A38"/>
+            <w:sz w:val="21"/>
+            <w:szCs w:val="21"/>
+            <w:u w:val="single"/>
+          </w:rPr>
+          <w:t xml:space="preserve">linkedin.com/in/christopher-færch</w:t>
+        </w:r>
+      </w:hyperlink>
     </w:p>
     <w:p>
       <w:pPr>
@@ -675,7 +696,7 @@
         </w:rPr>
         <w:t xml:space="preserve">   ·   Repository: </w:t>
       </w:r>
-      <w:hyperlink w:history="1" r:id="rIdhikvxznskrv2bvyzqpwol">
+      <w:hyperlink w:history="1" r:id="rIdheirdttqqksl1pb_xwxlq">
         <w:r>
           <w:rPr>
             <w:rFonts w:ascii="Calibri" w:cs="Calibri" w:eastAsia="Calibri" w:hAnsi="Calibri"/>
@@ -836,7 +857,7 @@
         </w:rPr>
         <w:t xml:space="preserve">   ·   Repository: </w:t>
       </w:r>
-      <w:hyperlink w:history="1" r:id="rId0jfvwtcg5xufljwhanynt">
+      <w:hyperlink w:history="1" r:id="rIde2tc0jyvpoc9ratx_yibk">
         <w:r>
           <w:rPr>
             <w:rFonts w:ascii="Calibri" w:cs="Calibri" w:eastAsia="Calibri" w:hAnsi="Calibri"/>
@@ -927,7 +948,7 @@
         </w:rPr>
         <w:t xml:space="preserve">   ·   Repository: </w:t>
       </w:r>
-      <w:hyperlink w:history="1" r:id="rId1_8hz5xxvzutpfwp3b6eu">
+      <w:hyperlink w:history="1" r:id="rId_gnoi3nrkjvztyuo_fpaq">
         <w:r>
           <w:rPr>
             <w:rFonts w:ascii="Calibri" w:cs="Calibri" w:eastAsia="Calibri" w:hAnsi="Calibri"/>

</xml_diff>

<commit_message>
Add Interests (06) beside Languages (07); include interests in Word CVs
Co-Authored-By: Claude Fable 5.1 <noreply@anthropic.com>
</commit_message>
<xml_diff>
--- a/public/Phillip_Christopher_Faerch_CV.docx
+++ b/public/Phillip_Christopher_Faerch_CV.docx
@@ -43,7 +43,7 @@
         </w:rPr>
         <w:t xml:space="preserve">Address: Nyborgvej 103, 2. tv., 5000 Odense C   ·   +45 22 18 77 00   ·   </w:t>
       </w:r>
-      <w:hyperlink w:history="1" r:id="rIder0u8frgq8ab34rohuw4o">
+      <w:hyperlink w:history="1" r:id="rIdnu7xdyycuw-4kro4akxpy">
         <w:r>
           <w:rPr>
             <w:rFonts w:ascii="Calibri" w:cs="Calibri" w:eastAsia="Calibri" w:hAnsi="Calibri"/>
@@ -69,7 +69,7 @@
         </w:rPr>
         <w:t xml:space="preserve">Born: 15 January 2002   ·   GitHub: </w:t>
       </w:r>
-      <w:hyperlink w:history="1" r:id="rIdd0j1zg6b6m9tta-g-h3le">
+      <w:hyperlink w:history="1" r:id="rIdyei9kjbj_fpzuzluxzt7d">
         <w:r>
           <w:rPr>
             <w:rFonts w:ascii="Calibri" w:cs="Calibri" w:eastAsia="Calibri" w:hAnsi="Calibri"/>
@@ -90,7 +90,7 @@
         </w:rPr>
         <w:t xml:space="preserve">   ·   LinkedIn: </w:t>
       </w:r>
-      <w:hyperlink w:history="1" r:id="rIduhszdnpa7lqt0kl73krbh">
+      <w:hyperlink w:history="1" r:id="rIdnqhzp4_nd-s9807xnledc">
         <w:r>
           <w:rPr>
             <w:rFonts w:ascii="Calibri" w:cs="Calibri" w:eastAsia="Calibri" w:hAnsi="Calibri"/>
@@ -109,7 +109,7 @@
         <w:pBdr>
           <w:bottom w:val="single" w:color="D9D2C2" w:sz="6" w:space="4"/>
         </w:pBdr>
-        <w:spacing w:after="60" w:before="170"/>
+        <w:spacing w:after="50" w:before="150"/>
       </w:pPr>
       <w:r>
         <w:rPr>
@@ -143,7 +143,7 @@
         <w:pBdr>
           <w:bottom w:val="single" w:color="D9D2C2" w:sz="6" w:space="4"/>
         </w:pBdr>
-        <w:spacing w:after="60" w:before="170"/>
+        <w:spacing w:after="50" w:before="150"/>
       </w:pPr>
       <w:r>
         <w:rPr>
@@ -210,7 +210,7 @@
           <w:sz w:val="20"/>
           <w:szCs w:val="20"/>
         </w:rPr>
-        <w:t xml:space="preserve">Three-year industrial master’s: first year full-time, then part-time study combined with at least 25 hours a week of engineering work. Focus on AI, computer vision, machine learning, robot design and autonomous systems. Taught in English.</w:t>
+        <w:t xml:space="preserve">Three-year industrial master’s: first year full-time, then part-time study combined with at least 25 hours a week of engineering work. Focus on AI, computer vision, machine learning, robot design and autonomous systems.</w:t>
       </w:r>
     </w:p>
     <w:p>
@@ -604,7 +604,7 @@
         <w:pBdr>
           <w:bottom w:val="single" w:color="D9D2C2" w:sz="6" w:space="4"/>
         </w:pBdr>
-        <w:spacing w:after="60" w:before="170"/>
+        <w:spacing w:after="50" w:before="150"/>
       </w:pPr>
       <w:r>
         <w:rPr>
@@ -696,7 +696,7 @@
         </w:rPr>
         <w:t xml:space="preserve">   ·   Repository: </w:t>
       </w:r>
-      <w:hyperlink w:history="1" r:id="rIdheirdttqqksl1pb_xwxlq">
+      <w:hyperlink w:history="1" r:id="rIdepvuhu7nxcgr_f_ml-ln7">
         <w:r>
           <w:rPr>
             <w:rFonts w:ascii="Calibri" w:cs="Calibri" w:eastAsia="Calibri" w:hAnsi="Calibri"/>
@@ -857,7 +857,7 @@
         </w:rPr>
         <w:t xml:space="preserve">   ·   Repository: </w:t>
       </w:r>
-      <w:hyperlink w:history="1" r:id="rIde2tc0jyvpoc9ratx_yibk">
+      <w:hyperlink w:history="1" r:id="rIdb5wk4o8_kwgrfjzle0t19">
         <w:r>
           <w:rPr>
             <w:rFonts w:ascii="Calibri" w:cs="Calibri" w:eastAsia="Calibri" w:hAnsi="Calibri"/>
@@ -948,7 +948,7 @@
         </w:rPr>
         <w:t xml:space="preserve">   ·   Repository: </w:t>
       </w:r>
-      <w:hyperlink w:history="1" r:id="rId_gnoi3nrkjvztyuo_fpaq">
+      <w:hyperlink w:history="1" r:id="rIdfe67b812eu7mcmemdntwn">
         <w:r>
           <w:rPr>
             <w:rFonts w:ascii="Calibri" w:cs="Calibri" w:eastAsia="Calibri" w:hAnsi="Calibri"/>
@@ -1037,7 +1037,7 @@
         <w:pBdr>
           <w:bottom w:val="single" w:color="D9D2C2" w:sz="6" w:space="4"/>
         </w:pBdr>
-        <w:spacing w:after="60" w:before="170"/>
+        <w:spacing w:after="50" w:before="150"/>
       </w:pPr>
       <w:r>
         <w:rPr>
@@ -1414,7 +1414,7 @@
         <w:pBdr>
           <w:bottom w:val="single" w:color="D9D2C2" w:sz="6" w:space="4"/>
         </w:pBdr>
-        <w:spacing w:after="60" w:before="170"/>
+        <w:spacing w:after="50" w:before="150"/>
       </w:pPr>
       <w:r>
         <w:rPr>
@@ -1534,7 +1534,7 @@
         <w:pBdr>
           <w:bottom w:val="single" w:color="D9D2C2" w:sz="6" w:space="4"/>
         </w:pBdr>
-        <w:spacing w:after="60" w:before="170"/>
+        <w:spacing w:after="50" w:before="150"/>
       </w:pPr>
       <w:r>
         <w:rPr>
@@ -1545,7 +1545,7 @@
           <w:sz w:val="26"/>
           <w:szCs w:val="26"/>
         </w:rPr>
-        <w:t xml:space="preserve">Languages</w:t>
+        <w:t xml:space="preserve">Interests</w:t>
       </w:r>
     </w:p>
     <w:p>
@@ -1559,12 +1559,37 @@
           <w:sz w:val="20"/>
           <w:szCs w:val="20"/>
         </w:rPr>
-        <w:t xml:space="preserve">Danish – Native   ·   English – Professional (studies taught in English)</w:t>
+        <w:t xml:space="preserve">Video games, mostly League of Legends, World of Warcraft and Counter-Strike. Working out two to three times a week and playing padel. Skiing whenever the season allows.</w:t>
+      </w:r>
+    </w:p>
+    <w:p>
+      <w:pPr>
+        <w:spacing w:after="50"/>
+      </w:pPr>
+      <w:r>
+        <w:rPr>
+          <w:rFonts w:ascii="Calibri" w:cs="Calibri" w:eastAsia="Calibri" w:hAnsi="Calibri"/>
+          <w:b/>
+          <w:bCs/>
+          <w:color w:val="2B2620"/>
+          <w:sz w:val="20"/>
+          <w:szCs w:val="20"/>
+        </w:rPr>
+        <w:t xml:space="preserve">Languages: </w:t>
+      </w:r>
+      <w:r>
+        <w:rPr>
+          <w:rFonts w:ascii="Calibri" w:cs="Calibri" w:eastAsia="Calibri" w:hAnsi="Calibri"/>
+          <w:color w:val="2B2620"/>
+          <w:sz w:val="20"/>
+          <w:szCs w:val="20"/>
+        </w:rPr>
+        <w:t xml:space="preserve">Danish – Native   ·   English – Professional</w:t>
       </w:r>
     </w:p>
     <w:sectPr>
       <w:pgSz w:w="11906" w:h="16838" w:orient="portrait"/>
-      <w:pgMar w:top="720" w:right="900" w:bottom="720" w:left="900" w:header="708" w:footer="708" w:gutter="0"/>
+      <w:pgMar w:top="640" w:right="900" w:bottom="640" w:left="900" w:header="708" w:footer="708" w:gutter="0"/>
       <w:pgNumType/>
       <w:docGrid w:linePitch="360"/>
     </w:sectPr>

</xml_diff>

<commit_message>
Update GitHub username to christopher-faerch in links, workflow and README
Co-Authored-By: Claude Fable 5.1 <noreply@anthropic.com>
</commit_message>
<xml_diff>
--- a/public/Phillip_Christopher_Faerch_CV.docx
+++ b/public/Phillip_Christopher_Faerch_CV.docx
@@ -43,7 +43,7 @@
         </w:rPr>
         <w:t xml:space="preserve">Address: Nyborgvej 103, 2. tv., 5000 Odense C   ·   +45 22 18 77 00   ·   </w:t>
       </w:r>
-      <w:hyperlink w:history="1" r:id="rIdnu7xdyycuw-4kro4akxpy">
+      <w:hyperlink w:history="1" r:id="rIdhcegpi5iz9mrf3hkncwdm">
         <w:r>
           <w:rPr>
             <w:rFonts w:ascii="Calibri" w:cs="Calibri" w:eastAsia="Calibri" w:hAnsi="Calibri"/>
@@ -69,7 +69,7 @@
         </w:rPr>
         <w:t xml:space="preserve">Born: 15 January 2002   ·   GitHub: </w:t>
       </w:r>
-      <w:hyperlink w:history="1" r:id="rIdyei9kjbj_fpzuzluxzt7d">
+      <w:hyperlink w:history="1" r:id="rIdgxfbfg67itggx7awfjo1y">
         <w:r>
           <w:rPr>
             <w:rFonts w:ascii="Calibri" w:cs="Calibri" w:eastAsia="Calibri" w:hAnsi="Calibri"/>
@@ -78,7 +78,7 @@
             <w:szCs w:val="21"/>
             <w:u w:val="single"/>
           </w:rPr>
-          <w:t xml:space="preserve">Toasting-Snowdragon-9999</w:t>
+          <w:t xml:space="preserve">christopher-faerch</w:t>
         </w:r>
       </w:hyperlink>
       <w:r>
@@ -90,7 +90,7 @@
         </w:rPr>
         <w:t xml:space="preserve">   ·   LinkedIn: </w:t>
       </w:r>
-      <w:hyperlink w:history="1" r:id="rIdnqhzp4_nd-s9807xnledc">
+      <w:hyperlink w:history="1" r:id="rIdcgdqhorim-jeacj8dl2w5">
         <w:r>
           <w:rPr>
             <w:rFonts w:ascii="Calibri" w:cs="Calibri" w:eastAsia="Calibri" w:hAnsi="Calibri"/>
@@ -696,7 +696,7 @@
         </w:rPr>
         <w:t xml:space="preserve">   ·   Repository: </w:t>
       </w:r>
-      <w:hyperlink w:history="1" r:id="rIdepvuhu7nxcgr_f_ml-ln7">
+      <w:hyperlink w:history="1" r:id="rIdduqwkosqa4-rnd35qmve8">
         <w:r>
           <w:rPr>
             <w:rFonts w:ascii="Calibri" w:cs="Calibri" w:eastAsia="Calibri" w:hAnsi="Calibri"/>
@@ -705,7 +705,7 @@
             <w:szCs w:val="21"/>
             <w:u w:val="single"/>
           </w:rPr>
-          <w:t xml:space="preserve">github.com/Toasting-Snowdragon-9999/bio_inspired_muscle</w:t>
+          <w:t xml:space="preserve">github.com/christopher-faerch/bio_inspired_muscle</w:t>
         </w:r>
       </w:hyperlink>
     </w:p>
@@ -857,7 +857,7 @@
         </w:rPr>
         <w:t xml:space="preserve">   ·   Repository: </w:t>
       </w:r>
-      <w:hyperlink w:history="1" r:id="rIdb5wk4o8_kwgrfjzle0t19">
+      <w:hyperlink w:history="1" r:id="rId_ofn_uvzs7sncmdegk0j5">
         <w:r>
           <w:rPr>
             <w:rFonts w:ascii="Calibri" w:cs="Calibri" w:eastAsia="Calibri" w:hAnsi="Calibri"/>
@@ -866,7 +866,7 @@
             <w:szCs w:val="21"/>
             <w:u w:val="single"/>
           </w:rPr>
-          <w:t xml:space="preserve">github.com/Toasting-Snowdragon-9999/pan_tilt_control_system</w:t>
+          <w:t xml:space="preserve">github.com/christopher-faerch/pan_tilt_control_system</w:t>
         </w:r>
       </w:hyperlink>
     </w:p>
@@ -948,7 +948,7 @@
         </w:rPr>
         <w:t xml:space="preserve">   ·   Repository: </w:t>
       </w:r>
-      <w:hyperlink w:history="1" r:id="rIdfe67b812eu7mcmemdntwn">
+      <w:hyperlink w:history="1" r:id="rIdzsp7bntdgccy6kdbddqqd">
         <w:r>
           <w:rPr>
             <w:rFonts w:ascii="Calibri" w:cs="Calibri" w:eastAsia="Calibri" w:hAnsi="Calibri"/>
@@ -957,7 +957,7 @@
             <w:szCs w:val="21"/>
             <w:u w:val="single"/>
           </w:rPr>
-          <w:t xml:space="preserve">github.com/Toasting-Snowdragon-9999/Mobile_robotsystem</w:t>
+          <w:t xml:space="preserve">github.com/christopher-faerch/Mobile_robotsystem</w:t>
         </w:r>
       </w:hyperlink>
     </w:p>
@@ -1450,7 +1450,7 @@
           <w:sz w:val="20"/>
           <w:szCs w:val="20"/>
         </w:rPr>
-        <w:t xml:space="preserve">Part of an eight-person development team on a large codebase at 4X-Robots, Project work in small teams every semester, Report writing and oral defence, Curious, thorough, hands-on</w:t>
+        <w:t xml:space="preserve">Part of a six-person development team on a large codebase at 4X-Robots, Project work in small teams every semester, Report writing and oral defence, Curious, thorough, hands-on</w:t>
       </w:r>
     </w:p>
     <w:p>

</xml_diff>

<commit_message>
Rewrite profile as three paragraphs, slightly smaller text
Co-Authored-By: Claude Fable 5.1 <noreply@anthropic.com>
</commit_message>
<xml_diff>
--- a/public/Phillip_Christopher_Faerch_CV.docx
+++ b/public/Phillip_Christopher_Faerch_CV.docx
@@ -43,7 +43,7 @@
         </w:rPr>
         <w:t xml:space="preserve">Address: Nyborgvej 103, 2. tv., 5000 Odense C   ·   +45 22 18 77 00   ·   </w:t>
       </w:r>
-      <w:hyperlink w:history="1" r:id="rIdhcegpi5iz9mrf3hkncwdm">
+      <w:hyperlink w:history="1" r:id="rIddufrnytqaw5yzmnztoxmt">
         <w:r>
           <w:rPr>
             <w:rFonts w:ascii="Calibri" w:cs="Calibri" w:eastAsia="Calibri" w:hAnsi="Calibri"/>
@@ -69,7 +69,7 @@
         </w:rPr>
         <w:t xml:space="preserve">Born: 15 January 2002   ·   GitHub: </w:t>
       </w:r>
-      <w:hyperlink w:history="1" r:id="rIdgxfbfg67itggx7awfjo1y">
+      <w:hyperlink w:history="1" r:id="rIdi-2epnrk3nhnfyk3rfwux">
         <w:r>
           <w:rPr>
             <w:rFonts w:ascii="Calibri" w:cs="Calibri" w:eastAsia="Calibri" w:hAnsi="Calibri"/>
@@ -90,7 +90,7 @@
         </w:rPr>
         <w:t xml:space="preserve">   ·   LinkedIn: </w:t>
       </w:r>
-      <w:hyperlink w:history="1" r:id="rIdcgdqhorim-jeacj8dl2w5">
+      <w:hyperlink w:history="1" r:id="rIdh0nbh968t2bddyyrcsukb">
         <w:r>
           <w:rPr>
             <w:rFonts w:ascii="Calibri" w:cs="Calibri" w:eastAsia="Calibri" w:hAnsi="Calibri"/>
@@ -131,10 +131,38 @@
         <w:rPr>
           <w:rFonts w:ascii="Calibri" w:cs="Calibri" w:eastAsia="Calibri" w:hAnsi="Calibri"/>
           <w:color w:val="2B2620"/>
-          <w:sz w:val="20"/>
-          <w:szCs w:val="20"/>
-        </w:rPr>
-        <w:t xml:space="preserve">Robotics engineer with a BSc in Robot Systems from the University of Southern Denmark, now studying for the industrial MSc in Robotics in Odense while working as a software developer at 4X-Robots. I like working across the whole stack: from control loops running on microcontrollers and FPGAs, to physics simulation, control theory and learning-based methods. My bachelor project built a bio-inspired locomotion controller that makes a quadruped robot walk, trot and gallop in MuJoCo.</w:t>
+          <w:sz w:val="19"/>
+          <w:szCs w:val="19"/>
+        </w:rPr>
+        <w:t xml:space="preserve">I’m a robotics engineer with a BSc in Robot Systems from SDU, now on the industrial master’s in Robotics while working as a software developer at 4X-Robots. What drives me is software that solves a hard problem well. I enjoy working out the architecture, how the pieces fit together, and how a component can be generalised so it serves the next problem as well as the current one.</w:t>
+      </w:r>
+    </w:p>
+    <w:p>
+      <w:pPr>
+        <w:spacing w:after="50"/>
+      </w:pPr>
+      <w:r>
+        <w:rPr>
+          <w:rFonts w:ascii="Calibri" w:cs="Calibri" w:eastAsia="Calibri" w:hAnsi="Calibri"/>
+          <w:color w:val="2B2620"/>
+          <w:sz w:val="19"/>
+          <w:szCs w:val="19"/>
+        </w:rPr>
+        <w:t xml:space="preserve">I like teams where everyone has a clear role. I’m at my best when I can go into my own bubble with a specific piece, work it through in depth, and then bring the findings back to the team as the work progresses. Structured analysis, hands-on development and continuous iteration are how I get from an idea to something reliable.</w:t>
+      </w:r>
+    </w:p>
+    <w:p>
+      <w:pPr>
+        <w:spacing w:after="50"/>
+      </w:pPr>
+      <w:r>
+        <w:rPr>
+          <w:rFonts w:ascii="Calibri" w:cs="Calibri" w:eastAsia="Calibri" w:hAnsi="Calibri"/>
+          <w:color w:val="2B2620"/>
+          <w:sz w:val="19"/>
+          <w:szCs w:val="19"/>
+        </w:rPr>
+        <w:t xml:space="preserve">I also bring a lot of experience working with people, from teaching and customer service to helping colleagues get up to speed. I’m patient, I enjoy passing on what I know, and I’d rather explain something twice than see someone stuck.</w:t>
       </w:r>
     </w:p>
     <w:p>
@@ -207,8 +235,8 @@
         <w:rPr>
           <w:rFonts w:ascii="Calibri" w:cs="Calibri" w:eastAsia="Calibri" w:hAnsi="Calibri"/>
           <w:color w:val="2B2620"/>
-          <w:sz w:val="20"/>
-          <w:szCs w:val="20"/>
+          <w:sz w:val="19"/>
+          <w:szCs w:val="19"/>
         </w:rPr>
         <w:t xml:space="preserve">Three-year industrial master’s: first year full-time, then part-time study combined with at least 25 hours a week of engineering work. Focus on AI, computer vision, machine learning, robot design and autonomous systems.</w:t>
       </w:r>
@@ -263,8 +291,8 @@
         <w:rPr>
           <w:rFonts w:ascii="Calibri" w:cs="Calibri" w:eastAsia="Calibri" w:hAnsi="Calibri"/>
           <w:color w:val="2B2620"/>
-          <w:sz w:val="20"/>
-          <w:szCs w:val="20"/>
+          <w:sz w:val="19"/>
+          <w:szCs w:val="19"/>
         </w:rPr>
         <w:t xml:space="preserve">180 ECTS across mathematics, electronics, embedded programming, control engineering, signal processing, robotics and AI, with a hands-on semester project every semester.</w:t>
       </w:r>
@@ -668,8 +696,8 @@
         <w:rPr>
           <w:rFonts w:ascii="Calibri" w:cs="Calibri" w:eastAsia="Calibri" w:hAnsi="Calibri"/>
           <w:color w:val="2B2620"/>
-          <w:sz w:val="20"/>
-          <w:szCs w:val="20"/>
+          <w:sz w:val="19"/>
+          <w:szCs w:val="19"/>
         </w:rPr>
         <w:t xml:space="preserve">A locomotion controller for the Unitree Go2 quadruped in the MuJoCo physics simulator, built without a full-body dynamic model. Four coupled Kuramoto oscillators form a central pattern generator that sets the gait rhythm, foot trajectories are solved with Levenberg–Marquardt inverse kinematics, and joints are driven by a muscle-like adaptive impedance controller (OIAC). Gait parameters are tuned with PPO and CMA-ES.</w:t>
       </w:r>
@@ -696,7 +724,7 @@
         </w:rPr>
         <w:t xml:space="preserve">   ·   Repository: </w:t>
       </w:r>
-      <w:hyperlink w:history="1" r:id="rIdduqwkosqa4-rnd35qmve8">
+      <w:hyperlink w:history="1" r:id="rIdjfrke9kjf91vyrqgte1ar">
         <w:r>
           <w:rPr>
             <w:rFonts w:ascii="Calibri" w:cs="Calibri" w:eastAsia="Calibri" w:hAnsi="Calibri"/>
@@ -759,8 +787,8 @@
         <w:rPr>
           <w:rFonts w:ascii="Calibri" w:cs="Calibri" w:eastAsia="Calibri" w:hAnsi="Calibri"/>
           <w:color w:val="2B2620"/>
-          <w:sz w:val="20"/>
-          <w:szCs w:val="20"/>
+          <w:sz w:val="19"/>
+          <w:szCs w:val="19"/>
         </w:rPr>
         <w:t xml:space="preserve">A 2-DOF thumb–index hand exoskeleton concept for Parkinsonian tremor. Surface EMG is processed in Python to separate voluntary grasp intent from tremor-band muscle activity, so that adaptive stiffness or damping is applied only while tremor is present and natural movement is preserved.</w:t>
       </w:r>
@@ -829,8 +857,8 @@
         <w:rPr>
           <w:rFonts w:ascii="Calibri" w:cs="Calibri" w:eastAsia="Calibri" w:hAnsi="Calibri"/>
           <w:color w:val="2B2620"/>
-          <w:sz w:val="20"/>
-          <w:szCs w:val="20"/>
+          <w:sz w:val="19"/>
+          <w:szCs w:val="19"/>
         </w:rPr>
         <w:t xml:space="preserve">Closed-loop control of a two-axis pan-tilt camera platform. A Tiva TM4C123 microcontroller running FreeRTOS executes the control loops and talks over SPI to a PYNQ-Z2 FPGA, where VHDL modules generate motor PWM and decode the encoders. An OpenCV pipeline in C++ detects a tennis ball and feeds its position to the controller so the platform follows it.</w:t>
       </w:r>
@@ -857,7 +885,7 @@
         </w:rPr>
         <w:t xml:space="preserve">   ·   Repository: </w:t>
       </w:r>
-      <w:hyperlink w:history="1" r:id="rId_ofn_uvzs7sncmdegk0j5">
+      <w:hyperlink w:history="1" r:id="rIddqkkk8fdkxawttxw5dgej">
         <w:r>
           <w:rPr>
             <w:rFonts w:ascii="Calibri" w:cs="Calibri" w:eastAsia="Calibri" w:hAnsi="Calibri"/>
@@ -920,8 +948,8 @@
         <w:rPr>
           <w:rFonts w:ascii="Calibri" w:cs="Calibri" w:eastAsia="Calibri" w:hAnsi="Calibri"/>
           <w:color w:val="2B2620"/>
-          <w:sz w:val="20"/>
-          <w:szCs w:val="20"/>
+          <w:sz w:val="19"/>
+          <w:szCs w:val="19"/>
         </w:rPr>
         <w:t xml:space="preserve">A TurtleBot3 Burger that executes paths sent to it as sound. A GUI builds the path, a self-designed half-duplex protocol encodes it as DTMF tones, and the robot decodes them in real time with the Goertzel algorithm and drives the route through ROS 2. The C++ code follows a four-layer architecture inspired by TCP/IP (physical, data link, transport, application) with CRC error detection, acknowledgements and retransmission timers. Verified reliable with up to 60 dBA background noise; 100 bits transferred in 4.4 s.</w:t>
       </w:r>
@@ -948,7 +976,7 @@
         </w:rPr>
         <w:t xml:space="preserve">   ·   Repository: </w:t>
       </w:r>
-      <w:hyperlink w:history="1" r:id="rIdzsp7bntdgccy6kdbddqqd">
+      <w:hyperlink w:history="1" r:id="rIdgvc83a9ot3bnaxrsvf7iv">
         <w:r>
           <w:rPr>
             <w:rFonts w:ascii="Calibri" w:cs="Calibri" w:eastAsia="Calibri" w:hAnsi="Calibri"/>
@@ -1011,8 +1039,8 @@
         <w:rPr>
           <w:rFonts w:ascii="Calibri" w:cs="Calibri" w:eastAsia="Calibri" w:hAnsi="Calibri"/>
           <w:color w:val="2B2620"/>
-          <w:sz w:val="20"/>
-          <w:szCs w:val="20"/>
+          <w:sz w:val="19"/>
+          <w:szCs w:val="19"/>
         </w:rPr>
         <w:t xml:space="preserve">A from-scratch OpenGL engine in modern C++ with a streamed procedural voxel planet as the test world. Chunk generation and meshing run on a priority job system across worker threads while the render thread uploads to the GPU, keeping the world at well over 1000 fps as the player moves. Includes a quaternion-based free-flight camera, day/night lighting, a Fresnel ocean shader, an entity and inventory system, and an ImGui debug overlay. Built with CMake, GLFW, GLAD, GLM, Assimp and headless test suites.</w:t>
       </w:r>
@@ -1096,8 +1124,8 @@
         <w:rPr>
           <w:rFonts w:ascii="Calibri" w:cs="Calibri" w:eastAsia="Calibri" w:hAnsi="Calibri"/>
           <w:color w:val="2B2620"/>
-          <w:sz w:val="20"/>
-          <w:szCs w:val="20"/>
+          <w:sz w:val="19"/>
+          <w:szCs w:val="19"/>
         </w:rPr>
         <w:t xml:space="preserve">Built a production-line application that flashes every board in the robot and supports testing and setup of a new robot. Implemented backend support for the conveyor-tracking feature, plus logging and other smaller features.</w:t>
       </w:r>
@@ -1147,8 +1175,8 @@
         <w:rPr>
           <w:rFonts w:ascii="Calibri" w:cs="Calibri" w:eastAsia="Calibri" w:hAnsi="Calibri"/>
           <w:color w:val="2B2620"/>
-          <w:sz w:val="20"/>
-          <w:szCs w:val="20"/>
+          <w:sz w:val="19"/>
+          <w:szCs w:val="19"/>
         </w:rPr>
         <w:t xml:space="preserve">Member service, opening and closing, and upkeep of the gym over almost three years alongside school and university.</w:t>
       </w:r>
@@ -1198,8 +1226,8 @@
         <w:rPr>
           <w:rFonts w:ascii="Calibri" w:cs="Calibri" w:eastAsia="Calibri" w:hAnsi="Calibri"/>
           <w:color w:val="2B2620"/>
-          <w:sz w:val="20"/>
-          <w:szCs w:val="20"/>
+          <w:sz w:val="19"/>
+          <w:szCs w:val="19"/>
         </w:rPr>
         <w:t xml:space="preserve">Covered classes and after-school care at short notice across all primary-school years.</w:t>
       </w:r>
@@ -1249,8 +1277,8 @@
         <w:rPr>
           <w:rFonts w:ascii="Calibri" w:cs="Calibri" w:eastAsia="Calibri" w:hAnsi="Calibri"/>
           <w:color w:val="2B2620"/>
-          <w:sz w:val="20"/>
-          <w:szCs w:val="20"/>
+          <w:sz w:val="19"/>
+          <w:szCs w:val="19"/>
         </w:rPr>
         <w:t xml:space="preserve">Front desk, ticketing and guest service at a museum during the summer season.</w:t>
       </w:r>
@@ -1300,8 +1328,8 @@
         <w:rPr>
           <w:rFonts w:ascii="Calibri" w:cs="Calibri" w:eastAsia="Calibri" w:hAnsi="Calibri"/>
           <w:color w:val="2B2620"/>
-          <w:sz w:val="20"/>
-          <w:szCs w:val="20"/>
+          <w:sz w:val="19"/>
+          <w:szCs w:val="19"/>
         </w:rPr>
         <w:t xml:space="preserve">Checkout, restocking and customer service.</w:t>
       </w:r>
@@ -1351,8 +1379,8 @@
         <w:rPr>
           <w:rFonts w:ascii="Calibri" w:cs="Calibri" w:eastAsia="Calibri" w:hAnsi="Calibri"/>
           <w:color w:val="2B2620"/>
-          <w:sz w:val="20"/>
-          <w:szCs w:val="20"/>
+          <w:sz w:val="19"/>
+          <w:szCs w:val="19"/>
         </w:rPr>
         <w:t xml:space="preserve">Ran the bread stall on Stændertorvet and helped in the bakery and kitchen.</w:t>
       </w:r>
@@ -1402,8 +1430,8 @@
         <w:rPr>
           <w:rFonts w:ascii="Calibri" w:cs="Calibri" w:eastAsia="Calibri" w:hAnsi="Calibri"/>
           <w:color w:val="2B2620"/>
-          <w:sz w:val="20"/>
-          <w:szCs w:val="20"/>
+          <w:sz w:val="19"/>
+          <w:szCs w:val="19"/>
         </w:rPr>
         <w:t xml:space="preserve">Fixed delivery route twice a week.</w:t>
       </w:r>
@@ -1438,8 +1466,8 @@
           <w:b/>
           <w:bCs/>
           <w:color w:val="2B2620"/>
-          <w:sz w:val="20"/>
-          <w:szCs w:val="20"/>
+          <w:sz w:val="19"/>
+          <w:szCs w:val="19"/>
         </w:rPr>
         <w:t xml:space="preserve">Ways of working: </w:t>
       </w:r>
@@ -1447,8 +1475,8 @@
         <w:rPr>
           <w:rFonts w:ascii="Calibri" w:cs="Calibri" w:eastAsia="Calibri" w:hAnsi="Calibri"/>
           <w:color w:val="2B2620"/>
-          <w:sz w:val="20"/>
-          <w:szCs w:val="20"/>
+          <w:sz w:val="19"/>
+          <w:szCs w:val="19"/>
         </w:rPr>
         <w:t xml:space="preserve">Part of a six-person development team on a large codebase at 4X-Robots, Project work in small teams every semester, Report writing and oral defence, Curious, thorough, hands-on</w:t>
       </w:r>
@@ -1463,8 +1491,8 @@
           <w:b/>
           <w:bCs/>
           <w:color w:val="2B2620"/>
-          <w:sz w:val="20"/>
-          <w:szCs w:val="20"/>
+          <w:sz w:val="19"/>
+          <w:szCs w:val="19"/>
         </w:rPr>
         <w:t xml:space="preserve">Embedded &amp; hardware: </w:t>
       </w:r>
@@ -1472,8 +1500,8 @@
         <w:rPr>
           <w:rFonts w:ascii="Calibri" w:cs="Calibri" w:eastAsia="Calibri" w:hAnsi="Calibri"/>
           <w:color w:val="2B2620"/>
-          <w:sz w:val="20"/>
-          <w:szCs w:val="20"/>
+          <w:sz w:val="19"/>
+          <w:szCs w:val="19"/>
         </w:rPr>
         <w:t xml:space="preserve">C on ARM Cortex-M (Tiva TM4C123), FreeRTOS, VHDL / FPGA (PYNQ-Z2), SPI, UART, PWM, encoders, Basic analog &amp; digital electronics, Raspberry Pi Pico</w:t>
       </w:r>
@@ -1488,8 +1516,8 @@
           <w:b/>
           <w:bCs/>
           <w:color w:val="2B2620"/>
-          <w:sz w:val="20"/>
-          <w:szCs w:val="20"/>
+          <w:sz w:val="19"/>
+          <w:szCs w:val="19"/>
         </w:rPr>
         <w:t xml:space="preserve">Software &amp; AI: </w:t>
       </w:r>
@@ -1497,8 +1525,8 @@
         <w:rPr>
           <w:rFonts w:ascii="Calibri" w:cs="Calibri" w:eastAsia="Calibri" w:hAnsi="Calibri"/>
           <w:color w:val="2B2620"/>
-          <w:sz w:val="20"/>
-          <w:szCs w:val="20"/>
+          <w:sz w:val="19"/>
+          <w:szCs w:val="19"/>
         </w:rPr>
         <w:t xml:space="preserve">Python (NumPy, SciPy, Gymnasium, Stable-Baselines3), C++ (CMake), MATLAB, OpenCV, Reinforcement learning (PPO, Q-learning), Signal processing &amp; EMG, Git, GitHub, Bitbucket, LaTeX, Testing &amp; code quality: pytest, mypy, flake8, pylint, Linux (Ubuntu &amp; Arch), Windows</w:t>
       </w:r>
@@ -1513,8 +1541,8 @@
           <w:b/>
           <w:bCs/>
           <w:color w:val="2B2620"/>
-          <w:sz w:val="20"/>
-          <w:szCs w:val="20"/>
+          <w:sz w:val="19"/>
+          <w:szCs w:val="19"/>
         </w:rPr>
         <w:t xml:space="preserve">Robotics &amp; control: </w:t>
       </w:r>
@@ -1522,8 +1550,8 @@
         <w:rPr>
           <w:rFonts w:ascii="Calibri" w:cs="Calibri" w:eastAsia="Calibri" w:hAnsi="Calibri"/>
           <w:color w:val="2B2620"/>
-          <w:sz w:val="20"/>
-          <w:szCs w:val="20"/>
+          <w:sz w:val="19"/>
+          <w:szCs w:val="19"/>
         </w:rPr>
         <w:t xml:space="preserve">Control theory (PID, state space, sliding mode), Robot kinematics &amp; inverse kinematics, Central pattern generators, Path planning (A*, bug algorithms), MuJoCo simulation, Underactuated systems</w:t>
       </w:r>
@@ -1556,8 +1584,8 @@
         <w:rPr>
           <w:rFonts w:ascii="Calibri" w:cs="Calibri" w:eastAsia="Calibri" w:hAnsi="Calibri"/>
           <w:color w:val="2B2620"/>
-          <w:sz w:val="20"/>
-          <w:szCs w:val="20"/>
+          <w:sz w:val="19"/>
+          <w:szCs w:val="19"/>
         </w:rPr>
         <w:t xml:space="preserve">Video games, mostly League of Legends, World of Warcraft and Counter-Strike. Working out two to three times a week and playing padel. Skiing whenever the season allows.</w:t>
       </w:r>
@@ -1572,8 +1600,8 @@
           <w:b/>
           <w:bCs/>
           <w:color w:val="2B2620"/>
-          <w:sz w:val="20"/>
-          <w:szCs w:val="20"/>
+          <w:sz w:val="19"/>
+          <w:szCs w:val="19"/>
         </w:rPr>
         <w:t xml:space="preserve">Languages: </w:t>
       </w:r>
@@ -1581,8 +1609,8 @@
         <w:rPr>
           <w:rFonts w:ascii="Calibri" w:cs="Calibri" w:eastAsia="Calibri" w:hAnsi="Calibri"/>
           <w:color w:val="2B2620"/>
-          <w:sz w:val="20"/>
-          <w:szCs w:val="20"/>
+          <w:sz w:val="19"/>
+          <w:szCs w:val="19"/>
         </w:rPr>
         <w:t xml:space="preserve">Danish – Native   ·   English – Professional</w:t>
       </w:r>
@@ -1785,8 +1813,8 @@
       <w:rPr>
         <w:rFonts w:ascii="Calibri" w:cs="Calibri" w:eastAsia="Calibri" w:hAnsi="Calibri"/>
         <w:color w:val="2B2620"/>
-        <w:sz w:val="20"/>
-        <w:szCs w:val="20"/>
+        <w:sz w:val="19"/>
+        <w:szCs w:val="19"/>
       </w:rPr>
     </w:rPrDefault>
     <w:pPrDefault/>

</xml_diff>

<commit_message>
Profile: driven by meaningful technical problems, with or without hardware
Co-Authored-By: Claude Fable 5.1 <noreply@anthropic.com>
</commit_message>
<xml_diff>
--- a/public/Phillip_Christopher_Faerch_CV.docx
+++ b/public/Phillip_Christopher_Faerch_CV.docx
@@ -43,7 +43,7 @@
         </w:rPr>
         <w:t xml:space="preserve">Address: Nyborgvej 103, 2. tv., 5000 Odense C   ·   +45 22 18 77 00   ·   </w:t>
       </w:r>
-      <w:hyperlink w:history="1" r:id="rIddufrnytqaw5yzmnztoxmt">
+      <w:hyperlink w:history="1" r:id="rIdll9-pqzwhlajl05lubsbn">
         <w:r>
           <w:rPr>
             <w:rFonts w:ascii="Calibri" w:cs="Calibri" w:eastAsia="Calibri" w:hAnsi="Calibri"/>
@@ -69,7 +69,7 @@
         </w:rPr>
         <w:t xml:space="preserve">Born: 15 January 2002   ·   GitHub: </w:t>
       </w:r>
-      <w:hyperlink w:history="1" r:id="rIdi-2epnrk3nhnfyk3rfwux">
+      <w:hyperlink w:history="1" r:id="rIdy_jkhkdrhd9srftxzbkvt">
         <w:r>
           <w:rPr>
             <w:rFonts w:ascii="Calibri" w:cs="Calibri" w:eastAsia="Calibri" w:hAnsi="Calibri"/>
@@ -90,7 +90,7 @@
         </w:rPr>
         <w:t xml:space="preserve">   ·   LinkedIn: </w:t>
       </w:r>
-      <w:hyperlink w:history="1" r:id="rIdh0nbh968t2bddyyrcsukb">
+      <w:hyperlink w:history="1" r:id="rIddc_xb13hbejc4obt-s6fb">
         <w:r>
           <w:rPr>
             <w:rFonts w:ascii="Calibri" w:cs="Calibri" w:eastAsia="Calibri" w:hAnsi="Calibri"/>
@@ -134,7 +134,7 @@
           <w:sz w:val="19"/>
           <w:szCs w:val="19"/>
         </w:rPr>
-        <w:t xml:space="preserve">I’m a robotics engineer with a BSc in Robot Systems from SDU, now on the industrial master’s in Robotics while working as a software developer at 4X-Robots. What drives me is software that solves a hard problem well. I enjoy working out the architecture, how the pieces fit together, and how a component can be generalised so it serves the next problem as well as the current one.</w:t>
+        <w:t xml:space="preserve">I’m a robotics engineer with a BSc in Robot Systems from SDU, now on the industrial master’s in Robotics while working as a software developer at 4X-Robots. What drives me is developing software that solves meaningful technical problems, whether or not hardware is involved. I enjoy working out the architecture, how the pieces fit together, and how a component can be generalised so it serves the next problem as well as the current one.</w:t>
       </w:r>
     </w:p>
     <w:p>
@@ -724,7 +724,7 @@
         </w:rPr>
         <w:t xml:space="preserve">   ·   Repository: </w:t>
       </w:r>
-      <w:hyperlink w:history="1" r:id="rIdjfrke9kjf91vyrqgte1ar">
+      <w:hyperlink w:history="1" r:id="rIdb0tbe3jluamhjf3ugtrq-">
         <w:r>
           <w:rPr>
             <w:rFonts w:ascii="Calibri" w:cs="Calibri" w:eastAsia="Calibri" w:hAnsi="Calibri"/>
@@ -885,7 +885,7 @@
         </w:rPr>
         <w:t xml:space="preserve">   ·   Repository: </w:t>
       </w:r>
-      <w:hyperlink w:history="1" r:id="rIddqkkk8fdkxawttxw5dgej">
+      <w:hyperlink w:history="1" r:id="rIdyofc170dj9uccit_najff">
         <w:r>
           <w:rPr>
             <w:rFonts w:ascii="Calibri" w:cs="Calibri" w:eastAsia="Calibri" w:hAnsi="Calibri"/>
@@ -976,7 +976,7 @@
         </w:rPr>
         <w:t xml:space="preserve">   ·   Repository: </w:t>
       </w:r>
-      <w:hyperlink w:history="1" r:id="rIdgvc83a9ot3bnaxrsvf7iv">
+      <w:hyperlink w:history="1" r:id="rIdn7jwpu5om3d8xkfvfdick">
         <w:r>
           <w:rPr>
             <w:rFonts w:ascii="Calibri" w:cs="Calibri" w:eastAsia="Calibri" w:hAnsi="Calibri"/>

</xml_diff>